<commit_message>
Bolum girisleri Kimya10/11 bicimine getirildi: bolum kapagi gorseli ve cok paragrafli giris metinleri
</commit_message>
<xml_diff>
--- a/Kim12-1-1-Redoks-Tepkimeleri.docx
+++ b/Kim12-1-1-Redoks-Tepkimeleri.docx
@@ -769,7 +769,7 @@
                 <w:rFonts w:ascii="Times New Roman" w:hAnsi="Times New Roman" w:cs="Times New Roman"/>
                 <w:lang w:val="tr-TR"/>
               </w:rPr>
-              <w:t xml:space="preserve">GÖRSEL ALANI</w:t>
+              <w:t xml:space="preserve">GÖRSEL ALANI (Bölüm kapağı, tam sayfa; Shutterstock)</w:t>
             </w:r>
           </w:p>
           <w:p>
@@ -785,7 +785,7 @@
                 <w:rFonts w:ascii="Times New Roman" w:hAnsi="Times New Roman" w:cs="Times New Roman"/>
                 <w:lang w:val="tr-TR"/>
               </w:rPr>
-              <w:t xml:space="preserve">Tarif: Gece gökyüzünde parlak beyaz ve renkli ışıklar saçan havai fişek gösterisi; ön planda su yüzeyine yansıyan ışıklar.</w:t>
+              <w:t xml:space="preserve">Tarif: Gece gökyüzünde parlak beyaz ve renkli ışıklar saçan havai fişek gösterisi; ön planda su yüzeyine yansıyan ışıklar (tam sayfa bölüm kapağı).</w:t>
             </w:r>
           </w:p>
           <w:p>
@@ -834,43 +834,50 @@
     </w:p>
     <w:p>
       <w:pPr>
-        <w:jc w:val="center"/>
-        <w:rPr>
-          <w:rFonts w:ascii="Times New Roman" w:hAnsi="Times New Roman" w:cs="Times New Roman"/>
-          <w:lang w:val="tr-TR"/>
-        </w:rPr>
-      </w:pPr>
-      <w:r>
-        <w:rPr>
-          <w:rFonts w:ascii="Times New Roman" w:hAnsi="Times New Roman" w:cs="Times New Roman"/>
-          <w:b/>
-          <w:bCs/>
-          <w:lang w:val="tr-TR"/>
-        </w:rPr>
-        <w:t xml:space="preserve">Görsel:</w:t>
-      </w:r>
-      <w:r>
-        <w:rPr>
-          <w:rFonts w:ascii="Times New Roman" w:hAnsi="Times New Roman" w:cs="Times New Roman"/>
-          <w:lang w:val="tr-TR"/>
-        </w:rPr>
-        <w:t xml:space="preserve"> Havai fişek gösterisi</w:t>
-      </w:r>
-    </w:p>
-    <w:p>
-      <w:pPr>
-        <w:jc w:val="both"/>
-        <w:rPr>
-          <w:rFonts w:ascii="Times New Roman" w:hAnsi="Times New Roman" w:cs="Times New Roman"/>
-          <w:lang w:val="tr-TR"/>
-        </w:rPr>
-      </w:pPr>
-      <w:r>
-        <w:rPr>
-          <w:rFonts w:ascii="Times New Roman" w:hAnsi="Times New Roman" w:cs="Times New Roman"/>
-          <w:lang w:val="tr-TR"/>
-        </w:rPr>
-        <w:t xml:space="preserve">Bayram ve kutlama gecelerinde gökyüzünü aydınlatan havai fişeklerin göz kamaştırıcı beyaz ışığı, büyük ölçüde magnezyum ve alüminyum gibi metallerin tozlarının yanmasından kaynaklanır. Bahçe kapısındaki demirin zamanla kızıl kahverengi bir tabakayla kaplanması, kesilen bir elmanın yüzeyinin kararması, bir el fenerindeki pilin ampulü yakması ve ülkemizde Artvin ile Kastamonu gibi illerde çıkarılan bakır cevherlerinden saf bakır elde edilmesi ilk bakışta birbirinden çok farklı olaylar gibi görünür. Oysa bu olayların hepsinde maddelerin tanecikleri arasında benzer bir etkileşim gerçekleşmektedir. Peki bu etkileşim nedir? Hangi metaller bu tür değişimlere daha kolay uğrar?</w:t>
+        <w:jc w:val="both"/>
+        <w:rPr>
+          <w:rFonts w:ascii="Times New Roman" w:hAnsi="Times New Roman" w:cs="Times New Roman"/>
+          <w:lang w:val="tr-TR"/>
+        </w:rPr>
+      </w:pPr>
+      <w:r>
+        <w:rPr>
+          <w:rFonts w:ascii="Times New Roman" w:hAnsi="Times New Roman" w:cs="Times New Roman"/>
+          <w:lang w:val="tr-TR"/>
+        </w:rPr>
+        <w:t xml:space="preserve">Bayram ve kutlama gecelerinde gökyüzünü aydınlatan havai fişeklerin göz kamaştırıcı beyaz ışığı, büyük ölçüde magnezyum ve alüminyum gibi metallerin tozlarının yanmasından kaynaklanır. Metal tozları alev aldığında saniyeler içinde göz kamaştırıcı bir ışık ve büyük miktarda ısı açığa çıkar.</w:t>
+      </w:r>
+    </w:p>
+    <w:p>
+      <w:pPr>
+        <w:jc w:val="both"/>
+        <w:rPr>
+          <w:rFonts w:ascii="Times New Roman" w:hAnsi="Times New Roman" w:cs="Times New Roman"/>
+          <w:lang w:val="tr-TR"/>
+        </w:rPr>
+      </w:pPr>
+      <w:r>
+        <w:rPr>
+          <w:rFonts w:ascii="Times New Roman" w:hAnsi="Times New Roman" w:cs="Times New Roman"/>
+          <w:lang w:val="tr-TR"/>
+        </w:rPr>
+        <w:t xml:space="preserve">Bahçe kapısındaki demirin zamanla kızıl kahverengi bir tabakayla kaplanması, kesilen bir elmanın yüzeyinin kararması, bir el fenerindeki pilin ampulü yakması ve ülkemizde Artvin ile Kastamonu gibi illerde çıkarılan bakır cevherlerinden saf bakır elde edilmesi ilk bakışta birbirinden çok farklı olaylar gibi görünür. Oysa bu olayların hepsinde maddelerin tanecikleri arasında benzer bir etkileşim gerçekleşmektedir. Peki bu etkileşim nedir? Hangi metaller bu tür değişimlere daha kolay uğrar?</w:t>
+      </w:r>
+    </w:p>
+    <w:p>
+      <w:pPr>
+        <w:jc w:val="both"/>
+        <w:rPr>
+          <w:rFonts w:ascii="Times New Roman" w:hAnsi="Times New Roman" w:cs="Times New Roman"/>
+          <w:lang w:val="tr-TR"/>
+        </w:rPr>
+      </w:pPr>
+      <w:r>
+        <w:rPr>
+          <w:rFonts w:ascii="Times New Roman" w:hAnsi="Times New Roman" w:cs="Times New Roman"/>
+          <w:lang w:val="tr-TR"/>
+        </w:rPr>
+        <w:t xml:space="preserve">Metallerin bu farklı davranışları insanlık tarihine de yön vermiştir. Doğada saf hâlde bulunabilen altın ve bakır, Anadolu’da binlerce yıl önce işlenmeye başlanmıştır. Demir gibi metallerin cevherlerinden elde edilmesi ise çok daha sonra, yüksek sıcaklıkta karbonla yapılan işlemler sayesinde mümkün olmuştur. Bugün de metallerin cevherlerinden elde edilmesi, korunması ve pillerde enerji kaynağı olarak kullanılması, metallerin tepkimeye girme yatkınlıklarının anlaşılmasına dayanır.</w:t>
       </w:r>
     </w:p>
     <w:p>

</xml_diff>

<commit_message>
Gorsel kutularina Shutterstock ID'leri eklendi
</commit_message>
<xml_diff>
--- a/Kim12-1-1-Redoks-Tepkimeleri.docx
+++ b/Kim12-1-1-Redoks-Tepkimeleri.docx
@@ -95,7 +95,7 @@
                 <w:rFonts w:ascii="Times New Roman" w:hAnsi="Times New Roman" w:cs="Times New Roman"/>
                 <w:lang w:val="tr-TR"/>
               </w:rPr>
-              <w:t xml:space="preserve">GÖRSEL ALANI</w:t>
+              <w:t xml:space="preserve">GÖRSEL ALANI (Shutterstock)</w:t>
             </w:r>
           </w:p>
           <w:p>
@@ -127,23 +127,7 @@
                 <w:rFonts w:ascii="Times New Roman" w:hAnsi="Times New Roman" w:cs="Times New Roman"/>
                 <w:lang w:val="tr-TR"/>
               </w:rPr>
-              <w:t xml:space="preserve">Shutterstock arama: “electric car charging battery city night”</w:t>
-            </w:r>
-          </w:p>
-          <w:p>
-            <w:pPr>
-              <w:jc w:val="both"/>
-              <w:rPr>
-                <w:rFonts w:ascii="Times New Roman" w:hAnsi="Times New Roman" w:cs="Times New Roman"/>
-                <w:lang w:val="tr-TR"/>
-              </w:rPr>
-            </w:pPr>
-            <w:r>
-              <w:rPr>
-                <w:rFonts w:ascii="Times New Roman" w:hAnsi="Times New Roman" w:cs="Times New Roman"/>
-                <w:lang w:val="tr-TR"/>
-              </w:rPr>
-              <w:t xml:space="preserve">Shutter ID: ……………</w:t>
+              <w:t xml:space="preserve">Shutter ID: 2551088649 (fotoğraf) — Electric car charging in urban parking lot at night</w:t>
             </w:r>
           </w:p>
         </w:tc>
@@ -801,23 +785,7 @@
                 <w:rFonts w:ascii="Times New Roman" w:hAnsi="Times New Roman" w:cs="Times New Roman"/>
                 <w:lang w:val="tr-TR"/>
               </w:rPr>
-              <w:t xml:space="preserve">Shutterstock arama: “white fireworks night sky reflection water”</w:t>
-            </w:r>
-          </w:p>
-          <w:p>
-            <w:pPr>
-              <w:jc w:val="both"/>
-              <w:rPr>
-                <w:rFonts w:ascii="Times New Roman" w:hAnsi="Times New Roman" w:cs="Times New Roman"/>
-                <w:lang w:val="tr-TR"/>
-              </w:rPr>
-            </w:pPr>
-            <w:r>
-              <w:rPr>
-                <w:rFonts w:ascii="Times New Roman" w:hAnsi="Times New Roman" w:cs="Times New Roman"/>
-                <w:lang w:val="tr-TR"/>
-              </w:rPr>
-              <w:t xml:space="preserve">Shutter ID: ……………</w:t>
+              <w:t xml:space="preserve">Shutter ID: 2819847141 (fotoğraf) — Single golden firework burst on black night sky</w:t>
             </w:r>
           </w:p>
         </w:tc>
@@ -1391,7 +1359,7 @@
                 <w:rFonts w:ascii="Times New Roman" w:hAnsi="Times New Roman" w:cs="Times New Roman"/>
                 <w:lang w:val="tr-TR"/>
               </w:rPr>
-              <w:t xml:space="preserve">GÖRSEL ALANI</w:t>
+              <w:t xml:space="preserve">GÖRSEL ALANI (Shutterstock)</w:t>
             </w:r>
           </w:p>
           <w:p>
@@ -1423,23 +1391,7 @@
                 <w:rFonts w:ascii="Times New Roman" w:hAnsi="Times New Roman" w:cs="Times New Roman"/>
                 <w:lang w:val="tr-TR"/>
               </w:rPr>
-              <w:t xml:space="preserve">Shutterstock arama: “plant microbial fuel cell electricity led”</w:t>
-            </w:r>
-          </w:p>
-          <w:p>
-            <w:pPr>
-              <w:jc w:val="both"/>
-              <w:rPr>
-                <w:rFonts w:ascii="Times New Roman" w:hAnsi="Times New Roman" w:cs="Times New Roman"/>
-                <w:lang w:val="tr-TR"/>
-              </w:rPr>
-            </w:pPr>
-            <w:r>
-              <w:rPr>
-                <w:rFonts w:ascii="Times New Roman" w:hAnsi="Times New Roman" w:cs="Times New Roman"/>
-                <w:lang w:val="tr-TR"/>
-              </w:rPr>
-              <w:t xml:space="preserve">Shutter ID: ……………</w:t>
+              <w:t xml:space="preserve">Shutter ID: 2614014509 (fotoğraf) — Electric light bulb containing a green plant (concept)</w:t>
             </w:r>
           </w:p>
         </w:tc>
@@ -1519,7 +1471,7 @@
                 <w:rFonts w:ascii="Times New Roman" w:hAnsi="Times New Roman" w:cs="Times New Roman"/>
                 <w:lang w:val="tr-TR"/>
               </w:rPr>
-              <w:t xml:space="preserve">GÖRSEL ALANI</w:t>
+              <w:t xml:space="preserve">GÖRSEL ALANI (Shutterstock)</w:t>
             </w:r>
           </w:p>
           <w:p>
@@ -1551,23 +1503,7 @@
                 <w:rFonts w:ascii="Times New Roman" w:hAnsi="Times New Roman" w:cs="Times New Roman"/>
                 <w:lang w:val="tr-TR"/>
               </w:rPr>
-              <w:t xml:space="preserve">Shutterstock arama: “iron nail copper sulfate solution reaction”</w:t>
-            </w:r>
-          </w:p>
-          <w:p>
-            <w:pPr>
-              <w:jc w:val="both"/>
-              <w:rPr>
-                <w:rFonts w:ascii="Times New Roman" w:hAnsi="Times New Roman" w:cs="Times New Roman"/>
-                <w:lang w:val="tr-TR"/>
-              </w:rPr>
-            </w:pPr>
-            <w:r>
-              <w:rPr>
-                <w:rFonts w:ascii="Times New Roman" w:hAnsi="Times New Roman" w:cs="Times New Roman"/>
-                <w:lang w:val="tr-TR"/>
-              </w:rPr>
-              <w:t xml:space="preserve">Shutter ID: ……………</w:t>
+              <w:t xml:space="preserve">Shutter ID: 2786394433 (fotoğraf) — Lab worker suspending an iron nail in copper sulfate solution with tweezers</w:t>
             </w:r>
           </w:p>
         </w:tc>
@@ -1990,7 +1926,7 @@
                 <w:rFonts w:ascii="Times New Roman" w:hAnsi="Times New Roman" w:cs="Times New Roman"/>
                 <w:lang w:val="tr-TR"/>
               </w:rPr>
-              <w:t xml:space="preserve">GÖRSEL ALANI</w:t>
+              <w:t xml:space="preserve">GÖRSEL ALANI (Shutterstock)</w:t>
             </w:r>
           </w:p>
           <w:p>
@@ -2022,23 +1958,7 @@
                 <w:rFonts w:ascii="Times New Roman" w:hAnsi="Times New Roman" w:cs="Times New Roman"/>
                 <w:lang w:val="tr-TR"/>
               </w:rPr>
-              <w:t xml:space="preserve">Shutterstock arama: “copper bazaar handmade copper pots”</w:t>
-            </w:r>
-          </w:p>
-          <w:p>
-            <w:pPr>
-              <w:jc w:val="both"/>
-              <w:rPr>
-                <w:rFonts w:ascii="Times New Roman" w:hAnsi="Times New Roman" w:cs="Times New Roman"/>
-                <w:lang w:val="tr-TR"/>
-              </w:rPr>
-            </w:pPr>
-            <w:r>
-              <w:rPr>
-                <w:rFonts w:ascii="Times New Roman" w:hAnsi="Times New Roman" w:cs="Times New Roman"/>
-                <w:lang w:val="tr-TR"/>
-              </w:rPr>
-              <w:t xml:space="preserve">Shutter ID: ……………</w:t>
+              <w:t xml:space="preserve">Shutter ID: 2664011831 (fotoğraf) — Copper coffee pots with traditional Turkish decoration</w:t>
             </w:r>
           </w:p>
         </w:tc>
@@ -2111,7 +2031,7 @@
                 <w:rFonts w:ascii="Times New Roman" w:hAnsi="Times New Roman" w:cs="Times New Roman"/>
                 <w:lang w:val="tr-TR"/>
               </w:rPr>
-              <w:t xml:space="preserve">GÖRSEL ALANI</w:t>
+              <w:t xml:space="preserve">GÖRSEL ALANI (Shutterstock)</w:t>
             </w:r>
           </w:p>
           <w:p>
@@ -2143,23 +2063,7 @@
                 <w:rFonts w:ascii="Times New Roman" w:hAnsi="Times New Roman" w:cs="Times New Roman"/>
                 <w:lang w:val="tr-TR"/>
               </w:rPr>
-              <w:t xml:space="preserve">Shutterstock arama: “magnesium ribbon burning bright white flame”</w:t>
-            </w:r>
-          </w:p>
-          <w:p>
-            <w:pPr>
-              <w:jc w:val="both"/>
-              <w:rPr>
-                <w:rFonts w:ascii="Times New Roman" w:hAnsi="Times New Roman" w:cs="Times New Roman"/>
-                <w:lang w:val="tr-TR"/>
-              </w:rPr>
-            </w:pPr>
-            <w:r>
-              <w:rPr>
-                <w:rFonts w:ascii="Times New Roman" w:hAnsi="Times New Roman" w:cs="Times New Roman"/>
-                <w:lang w:val="tr-TR"/>
-              </w:rPr>
-              <w:t xml:space="preserve">Shutter ID: ……………</w:t>
+              <w:t xml:space="preserve">Shutter ID: 1301157493 (fotoğraf) — Magnesium burns with bright white flame</w:t>
             </w:r>
           </w:p>
         </w:tc>
@@ -5814,7 +5718,7 @@
                 <w:rFonts w:ascii="Times New Roman" w:hAnsi="Times New Roman" w:cs="Times New Roman"/>
                 <w:lang w:val="tr-TR"/>
               </w:rPr>
-              <w:t xml:space="preserve">GÖRSEL ALANI</w:t>
+              <w:t xml:space="preserve">GÖRSEL ALANI (Shutterstock)</w:t>
             </w:r>
           </w:p>
           <w:p>
@@ -5846,23 +5750,7 @@
                 <w:rFonts w:ascii="Times New Roman" w:hAnsi="Times New Roman" w:cs="Times New Roman"/>
                 <w:lang w:val="tr-TR"/>
               </w:rPr>
-              <w:t xml:space="preserve">Shutterstock arama: “rusty iron chain padlock bolts”</w:t>
-            </w:r>
-          </w:p>
-          <w:p>
-            <w:pPr>
-              <w:jc w:val="both"/>
-              <w:rPr>
-                <w:rFonts w:ascii="Times New Roman" w:hAnsi="Times New Roman" w:cs="Times New Roman"/>
-                <w:lang w:val="tr-TR"/>
-              </w:rPr>
-            </w:pPr>
-            <w:r>
-              <w:rPr>
-                <w:rFonts w:ascii="Times New Roman" w:hAnsi="Times New Roman" w:cs="Times New Roman"/>
-                <w:lang w:val="tr-TR"/>
-              </w:rPr>
-              <w:t xml:space="preserve">Shutter ID: ……………</w:t>
+              <w:t xml:space="preserve">Shutter ID: 2837328711 (fotoğraf) — A rusty padlock and rusty metal chain</w:t>
             </w:r>
           </w:p>
         </w:tc>
@@ -6921,7 +6809,7 @@
                 <w:rFonts w:ascii="Times New Roman" w:hAnsi="Times New Roman" w:cs="Times New Roman"/>
                 <w:lang w:val="tr-TR"/>
               </w:rPr>
-              <w:t xml:space="preserve">GÖRSEL ALANI</w:t>
+              <w:t xml:space="preserve">GÖRSEL ALANI (Shutterstock)</w:t>
             </w:r>
           </w:p>
           <w:p>
@@ -6953,23 +6841,7 @@
                 <w:rFonts w:ascii="Times New Roman" w:hAnsi="Times New Roman" w:cs="Times New Roman"/>
                 <w:lang w:val="tr-TR"/>
               </w:rPr>
-              <w:t xml:space="preserve">Shutterstock arama: “thermite welding railway rails”</w:t>
-            </w:r>
-          </w:p>
-          <w:p>
-            <w:pPr>
-              <w:jc w:val="both"/>
-              <w:rPr>
-                <w:rFonts w:ascii="Times New Roman" w:hAnsi="Times New Roman" w:cs="Times New Roman"/>
-                <w:lang w:val="tr-TR"/>
-              </w:rPr>
-            </w:pPr>
-            <w:r>
-              <w:rPr>
-                <w:rFonts w:ascii="Times New Roman" w:hAnsi="Times New Roman" w:cs="Times New Roman"/>
-                <w:lang w:val="tr-TR"/>
-              </w:rPr>
-              <w:t xml:space="preserve">Shutter ID: ……………</w:t>
+              <w:t xml:space="preserve">Shutter ID: 2711259847 (fotoğraf) — Thermite welding on a railway track</w:t>
             </w:r>
           </w:p>
         </w:tc>

</xml_diff>

<commit_message>
Deney onerisi kutulari Kimya10 kalibina cevrildi: tasarim istenen etkinliklerde malzeme listesi ve plan alanlari, yonlendirilmis deneylerde gerekli malzemeler ve deney basamaklari
</commit_message>
<xml_diff>
--- a/Kim12-1-1-Redoks-Tepkimeleri.docx
+++ b/Kim12-1-1-Redoks-Tepkimeleri.docx
@@ -2701,125 +2701,98 @@
           <w:rFonts w:ascii="Times New Roman" w:hAnsi="Times New Roman" w:cs="Times New Roman"/>
           <w:lang w:val="tr-TR"/>
         </w:rPr>
-        <w:t xml:space="preserve">Aşağıdaki deney önerisini inceleyiniz. Grubunuzla birlikte belirlediğiniz ölçütleri kullanarak deneyleri gerçekleştiriniz. Her deneyde başlangıçtaki görünümü, tepkime sırasında ve sonrasında gördüğünüz değişimleri ilgili sütunlara kaydediniz. Beklemediğiniz bir gözlemle karşılaştığınızda bunu da not ediniz ve nedenini araştırınız.</w:t>
-      </w:r>
-    </w:p>
-    <w:tbl>
-      <w:tblPr>
-        <w:tblW w:w="9000" w:type="dxa"/>
-        <w:jc w:val="center"/>
-        <w:tblBorders>
-          <w:top w:val="single" w:sz="8" w:space="0" w:color="7F7F7F"/>
-          <w:left w:val="single" w:sz="8" w:space="0" w:color="7F7F7F"/>
-          <w:bottom w:val="single" w:sz="8" w:space="0" w:color="7F7F7F"/>
-          <w:right w:val="single" w:sz="8" w:space="0" w:color="7F7F7F"/>
-        </w:tblBorders>
-      </w:tblPr>
-      <w:tblGrid>
-        <w:gridCol w:w="9000"/>
-      </w:tblGrid>
-      <w:tr>
-        <w:tc>
-          <w:tcPr>
-            <w:tcW w:w="9000" w:type="dxa"/>
-            <w:shd w:val="clear" w:color="auto" w:fill="E2EFDA"/>
-          </w:tcPr>
-          <w:p>
-            <w:pPr>
-              <w:jc w:val="both"/>
-              <w:rPr>
-                <w:rFonts w:ascii="Times New Roman" w:hAnsi="Times New Roman" w:cs="Times New Roman"/>
-                <w:lang w:val="tr-TR"/>
-              </w:rPr>
-            </w:pPr>
-            <w:r>
-              <w:rPr>
-                <w:rFonts w:ascii="Times New Roman" w:hAnsi="Times New Roman" w:cs="Times New Roman"/>
-                <w:b/>
-                <w:bCs/>
-                <w:lang w:val="tr-TR"/>
-              </w:rPr>
-              <w:t xml:space="preserve">Deney önerisi</w:t>
-            </w:r>
-          </w:p>
-          <w:p>
-            <w:pPr>
-              <w:jc w:val="both"/>
-              <w:rPr>
-                <w:rFonts w:ascii="Times New Roman" w:hAnsi="Times New Roman" w:cs="Times New Roman"/>
-                <w:lang w:val="tr-TR"/>
-              </w:rPr>
-            </w:pPr>
-            <w:r>
-              <w:rPr>
-                <w:rFonts w:ascii="Times New Roman" w:hAnsi="Times New Roman" w:cs="Times New Roman"/>
-                <w:b/>
-                <w:bCs/>
-                <w:lang w:val="tr-TR"/>
-              </w:rPr>
-              <w:t xml:space="preserve">1. Deney (metal + oksijen):</w:t>
-            </w:r>
-            <w:r>
-              <w:rPr>
-                <w:rFonts w:ascii="Times New Roman" w:hAnsi="Times New Roman" w:cs="Times New Roman"/>
-                <w:lang w:val="tr-TR"/>
-              </w:rPr>
-              <w:t xml:space="preserve"> Öğretmeniniz yaklaşık 3 cm uzunluğundaki magnezyum şeridi maşayla tutarak ispirto ocağında yakacaktır. Ardından temizlenmiş bir bakır teli alevde 1 dakika ısıtınız ve soğuduktan sonra yüzeyini inceleyiniz.</w:t>
-            </w:r>
-          </w:p>
-          <w:p>
-            <w:pPr>
-              <w:jc w:val="both"/>
-              <w:rPr>
-                <w:rFonts w:ascii="Times New Roman" w:hAnsi="Times New Roman" w:cs="Times New Roman"/>
-                <w:lang w:val="tr-TR"/>
-              </w:rPr>
-            </w:pPr>
-            <w:r>
-              <w:rPr>
-                <w:rFonts w:ascii="Times New Roman" w:hAnsi="Times New Roman" w:cs="Times New Roman"/>
-                <w:b/>
-                <w:bCs/>
-                <w:lang w:val="tr-TR"/>
-              </w:rPr>
-              <w:t xml:space="preserve">2. Deney (metal + seyreltik hidroklorik asit):</w:t>
-            </w:r>
-            <w:r>
-              <w:rPr>
-                <w:rFonts w:ascii="Times New Roman" w:hAnsi="Times New Roman" w:cs="Times New Roman"/>
-                <w:lang w:val="tr-TR"/>
-              </w:rPr>
-              <w:t xml:space="preserve"> Üç deney tüpüne 3’er mL 1 M hidroklorik asit çözeltisi koyunuz. Tüplere sırasıyla birer küçük parça magnezyum şerit, çinko granül ve bakır tel ekleyiniz. Tüplerin dışına dokunarak sıcaklık değişimini hissetmeye çalışınız.</w:t>
-            </w:r>
-          </w:p>
-          <w:p>
-            <w:pPr>
-              <w:jc w:val="both"/>
-              <w:rPr>
-                <w:rFonts w:ascii="Times New Roman" w:hAnsi="Times New Roman" w:cs="Times New Roman"/>
-                <w:lang w:val="tr-TR"/>
-              </w:rPr>
-            </w:pPr>
-            <w:r>
-              <w:rPr>
-                <w:rFonts w:ascii="Times New Roman" w:hAnsi="Times New Roman" w:cs="Times New Roman"/>
-                <w:b/>
-                <w:bCs/>
-                <w:lang w:val="tr-TR"/>
-              </w:rPr>
-              <w:t xml:space="preserve">3. Deney (metal + metal tuzu çözeltisi):</w:t>
-            </w:r>
-            <w:r>
-              <w:rPr>
-                <w:rFonts w:ascii="Times New Roman" w:hAnsi="Times New Roman" w:cs="Times New Roman"/>
-                <w:lang w:val="tr-TR"/>
-              </w:rPr>
-              <w:t xml:space="preserve"> Bir behere 0,5 M bakır(II) nitrat çözeltisi koyarak temizlenmiş çinko şeridi daldırınız. Bir deney tüpündeki 0,1 M gümüş nitrat çözeltisine bakır tel, başka bir tüpteki 0,5 M çinko nitrat çözeltisine bakır tel daldırınız. Gözlemlerinizi 1., 5. ve 15. dakikalarda kaydediniz. İsterseniz çinko şeridin kütlesini deneyden önce ve sonra tartarak karşılaştırınız.</w:t>
-            </w:r>
-          </w:p>
-        </w:tc>
-      </w:tr>
-    </w:tbl>
+        <w:t xml:space="preserve">Deney basamaklarını takip ederek aşağıdaki deneyleri gerçekleştiriniz ve gözlemlerinizi grubunuzla birlikte belirlediğiniz ölçütleri kullanarak kaydediniz. Her deneyde başlangıçtaki görünümü, tepkime sırasında ve sonrasında gördüğünüz değişimleri ilgili sütunlara kaydediniz. Beklemediğiniz bir gözlemle karşılaştığınızda bunu da not ediniz ve nedenini araştırınız.</w:t>
+      </w:r>
+    </w:p>
+    <w:p>
+      <w:pPr>
+        <w:jc w:val="both"/>
+        <w:rPr>
+          <w:rFonts w:ascii="Times New Roman" w:hAnsi="Times New Roman" w:cs="Times New Roman"/>
+          <w:lang w:val="tr-TR"/>
+        </w:rPr>
+      </w:pPr>
+      <w:r>
+        <w:rPr>
+          <w:b/>
+          <w:rFonts w:ascii="Times New Roman" w:hAnsi="Times New Roman" w:cs="Times New Roman"/>
+          <w:lang w:val="tr-TR"/>
+        </w:rPr>
+        <w:t xml:space="preserve">Gerekli Malzemeler:</w:t>
+      </w:r>
+      <w:r>
+        <w:rPr>
+          <w:rFonts w:ascii="Times New Roman" w:hAnsi="Times New Roman" w:cs="Times New Roman"/>
+          <w:lang w:val="tr-TR"/>
+        </w:rPr>
+        <w:t xml:space="preserve"> magnezyum şerit, bakır tel, çinko granül, çinko şerit, 1 M hidroklorik asit çözeltisi, 0,5 M bakır(II) nitrat çözeltisi, 0,1 M gümüş nitrat çözeltisi, 0,5 M çinko nitrat çözeltisi, ispirto ocağı, maşa, zımpara kâğıdı, deney tüpleri, beher, terazi.</w:t>
+      </w:r>
+    </w:p>
+    <w:p>
+      <w:pPr>
+        <w:jc w:val="both"/>
+        <w:rPr>
+          <w:rFonts w:ascii="Times New Roman" w:hAnsi="Times New Roman" w:cs="Times New Roman"/>
+          <w:lang w:val="tr-TR"/>
+        </w:rPr>
+      </w:pPr>
+      <w:r>
+        <w:rPr>
+          <w:b/>
+          <w:rFonts w:ascii="Times New Roman" w:hAnsi="Times New Roman" w:cs="Times New Roman"/>
+          <w:lang w:val="tr-TR"/>
+        </w:rPr>
+        <w:t xml:space="preserve">Deney Basamakları:</w:t>
+      </w:r>
+    </w:p>
+    <w:p>
+      <w:pPr>
+        <w:jc w:val="both"/>
+        <w:rPr>
+          <w:rFonts w:ascii="Times New Roman" w:hAnsi="Times New Roman" w:cs="Times New Roman"/>
+          <w:lang w:val="tr-TR"/>
+        </w:rPr>
+      </w:pPr>
+      <w:r>
+        <w:rPr>
+          <w:rFonts w:ascii="Times New Roman" w:hAnsi="Times New Roman" w:cs="Times New Roman"/>
+          <w:lang w:val="tr-TR"/>
+        </w:rPr>
+        <w:t xml:space="preserve">1. Metal + oksijen: Öğretmeniniz yaklaşık 3 cm uzunluğundaki magnezyum şeridi maşayla tutarak ispirto ocağında yakacaktır. Ardından temizlenmiş bir bakır teli alevde 1 dakika ısıtınız ve soğuduktan sonra yüzeyini inceleyiniz.</w:t>
+      </w:r>
+    </w:p>
+    <w:p>
+      <w:pPr>
+        <w:jc w:val="both"/>
+        <w:rPr>
+          <w:rFonts w:ascii="Times New Roman" w:hAnsi="Times New Roman" w:cs="Times New Roman"/>
+          <w:lang w:val="tr-TR"/>
+        </w:rPr>
+      </w:pPr>
+      <w:r>
+        <w:rPr>
+          <w:rFonts w:ascii="Times New Roman" w:hAnsi="Times New Roman" w:cs="Times New Roman"/>
+          <w:lang w:val="tr-TR"/>
+        </w:rPr>
+        <w:t xml:space="preserve">2. Metal + seyreltik hidroklorik asit: Üç deney tüpüne 3’er mL 1 M hidroklorik asit çözeltisi koyunuz. Tüplere sırasıyla birer küçük parça magnezyum şerit, çinko granül ve bakır tel ekleyiniz. Tüplerin dışına dokunarak sıcaklık değişimini hissetmeye çalışınız.</w:t>
+      </w:r>
+    </w:p>
+    <w:p>
+      <w:pPr>
+        <w:jc w:val="both"/>
+        <w:rPr>
+          <w:rFonts w:ascii="Times New Roman" w:hAnsi="Times New Roman" w:cs="Times New Roman"/>
+          <w:lang w:val="tr-TR"/>
+        </w:rPr>
+      </w:pPr>
+      <w:r>
+        <w:rPr>
+          <w:rFonts w:ascii="Times New Roman" w:hAnsi="Times New Roman" w:cs="Times New Roman"/>
+          <w:lang w:val="tr-TR"/>
+        </w:rPr>
+        <w:t xml:space="preserve">3. Metal + metal tuzu çözeltisi: Bir behere 0,5 M bakır(II) nitrat çözeltisi koyarak temizlenmiş çinko şeridi daldırınız. Bir deney tüpündeki 0,1 M gümüş nitrat çözeltisine bakır tel, başka bir tüpteki 0,5 M çinko nitrat çözeltisine bakır tel daldırınız. Gözlemlerinizi 1., 5. ve 15. dakikalarda kaydediniz. İsterseniz çinko şeridin kütlesini deneyden önce ve sonra tartarak karşılaştırınız.</w:t>
+      </w:r>
+    </w:p>
     <w:p>
       <w:pPr>
         <w:jc w:val="both"/>

</xml_diff>

<commit_message>
Tema 1: 16 gorsel baski boyutunda yeniden cizildi (yazilar 9-12 punto); Fe-Cu ve Mg-Ni tanecik modellerinde iyon etiketleri kurelere sigacak bicimde buyutuldu
</commit_message>
<xml_diff>
--- a/Kim12-1-1-Redoks-Tepkimeleri.docx
+++ b/Kim12-1-1-Redoks-Tepkimeleri.docx
@@ -3843,7 +3843,7 @@
       <w:r>
         <w:drawing>
           <wp:inline distT="0" distB="0" distL="0" distR="0">
-            <wp:extent cx="5580000" cy="1984528"/>
+            <wp:extent cx="5596139" cy="2069596"/>
             <wp:docPr id="900003" name="Grafik 900003" descr="Süreç aşamalı tanecik modeli çizim alanı"/>
             <wp:cNvGraphicFramePr>
               <a:graphicFrameLocks noChangeAspect="1"/>
@@ -3864,7 +3864,7 @@
                   <pic:spPr>
                     <a:xfrm>
                       <a:off x="0" y="0"/>
-                      <a:ext cx="5580000" cy="1984528"/>
+                      <a:ext cx="5596139" cy="2069596"/>
                     </a:xfrm>
                     <a:prstGeom prst="rect">
                       <a:avLst/>
@@ -4596,7 +4596,7 @@
       <w:r>
         <w:drawing>
           <wp:inline distT="0" distB="0" distL="0" distR="0">
-            <wp:extent cx="5760000" cy="1996800"/>
+            <wp:extent cx="5504699" cy="1877571"/>
             <wp:docPr id="900007" name="Grafik 900007" descr="Fe ve Cu2+ tepkimesinin süreç aşamalı tanecik modeli"/>
             <wp:cNvGraphicFramePr>
               <a:graphicFrameLocks noChangeAspect="1"/>
@@ -4617,7 +4617,7 @@
                   <pic:spPr>
                     <a:xfrm>
                       <a:off x="0" y="0"/>
-                      <a:ext cx="5760000" cy="1996800"/>
+                      <a:ext cx="5504699" cy="1877571"/>
                     </a:xfrm>
                     <a:prstGeom prst="rect">
                       <a:avLst/>

</xml_diff>

<commit_message>
Kim12-1-1-Redoks-Tepkimeleri: gorsel alanlarina Shutter onizlemeleri yerlestirildi (2.3 bicimi)
</commit_message>
<xml_diff>
--- a/Kim12-1-1-Redoks-Tepkimeleri.docx
+++ b/Kim12-1-1-Redoks-Tepkimeleri.docx
@@ -62,743 +62,691 @@
         <w:t xml:space="preserve">BÖLÜM: Elektrokimyasal Hücreler</w:t>
       </w:r>
     </w:p>
-    <w:tbl>
-      <w:tblPr>
-        <w:tblW w:w="9000" w:type="dxa"/>
+    <w:p>
+      <w:pPr>
         <w:jc w:val="center"/>
-        <w:tblBorders>
-          <w:top w:val="single" w:sz="8" w:space="0" w:color="7F7F7F"/>
-          <w:left w:val="single" w:sz="8" w:space="0" w:color="7F7F7F"/>
-          <w:bottom w:val="single" w:sz="8" w:space="0" w:color="7F7F7F"/>
-          <w:right w:val="single" w:sz="8" w:space="0" w:color="7F7F7F"/>
-        </w:tblBorders>
-      </w:tblPr>
-      <w:tblGrid>
-        <w:gridCol w:w="9000"/>
-      </w:tblGrid>
-      <w:tr>
-        <w:tc>
-          <w:tcPr>
-            <w:tcW w:w="9000" w:type="dxa"/>
-            <w:shd w:val="clear" w:color="auto" w:fill="EDEDED"/>
-          </w:tcPr>
-          <w:p>
-            <w:pPr>
-              <w:jc w:val="both"/>
-              <w:rPr>
-                <w:rFonts w:ascii="Times New Roman" w:hAnsi="Times New Roman" w:cs="Times New Roman"/>
-                <w:lang w:val="tr-TR"/>
-              </w:rPr>
-            </w:pPr>
-            <w:r>
-              <w:rPr>
-                <w:rFonts w:ascii="Times New Roman" w:hAnsi="Times New Roman" w:cs="Times New Roman"/>
-                <w:lang w:val="tr-TR"/>
-              </w:rPr>
-              <w:t xml:space="preserve">GÖRSEL ALANI (Shutterstock)</w:t>
-            </w:r>
-          </w:p>
-          <w:p>
-            <w:pPr>
-              <w:jc w:val="both"/>
-              <w:rPr>
-                <w:rFonts w:ascii="Times New Roman" w:hAnsi="Times New Roman" w:cs="Times New Roman"/>
-                <w:lang w:val="tr-TR"/>
-              </w:rPr>
-            </w:pPr>
-            <w:r>
-              <w:rPr>
-                <w:rFonts w:ascii="Times New Roman" w:hAnsi="Times New Roman" w:cs="Times New Roman"/>
-                <w:lang w:val="tr-TR"/>
-              </w:rPr>
-              <w:t xml:space="preserve">Tarif: Tam sayfa tema açılış görseli: Gece aydınlatılmış bir şehir manzarası önünde şarj olan bir elektrikli otomobil ile yan yana dizilmiş farklı boyutlarda piller; köşede yüzeyi paslanmış eski bir demir zincir (marka/logo görünmesin).</w:t>
-            </w:r>
-          </w:p>
-          <w:p>
-            <w:pPr>
-              <w:jc w:val="both"/>
-              <w:rPr>
-                <w:rFonts w:ascii="Times New Roman" w:hAnsi="Times New Roman" w:cs="Times New Roman"/>
-                <w:lang w:val="tr-TR"/>
-              </w:rPr>
-            </w:pPr>
-            <w:r>
-              <w:rPr>
-                <w:rFonts w:ascii="Times New Roman" w:hAnsi="Times New Roman" w:cs="Times New Roman"/>
-                <w:lang w:val="tr-TR"/>
-              </w:rPr>
-              <w:t xml:space="preserve">Shutter ID: 2551088649 (fotoğraf) — Electric car charging in urban parking lot at night</w:t>
-            </w:r>
-          </w:p>
-        </w:tc>
-      </w:tr>
-    </w:tbl>
-    <w:p>
-      <w:pPr>
-        <w:jc w:val="both"/>
-        <w:rPr>
-          <w:rFonts w:ascii="Times New Roman" w:hAnsi="Times New Roman" w:cs="Times New Roman"/>
-          <w:lang w:val="tr-TR"/>
-        </w:rPr>
-      </w:pPr>
+      </w:pPr>
+      <w:r>
+        <w:drawing>
+          <wp:inline xmlns:a="http://schemas.openxmlformats.org/drawingml/2006/main" xmlns:pic="http://schemas.openxmlformats.org/drawingml/2006/picture">
+            <wp:extent cx="3436363" cy="2520000"/>
+            <wp:docPr id="900013" name="Picture 900013"/>
+            <wp:cNvGraphicFramePr>
+              <a:graphicFrameLocks noChangeAspect="1"/>
+            </wp:cNvGraphicFramePr>
+            <a:graphic>
+              <a:graphicData uri="http://schemas.openxmlformats.org/drawingml/2006/picture">
+                <pic:pic>
+                  <pic:nvPicPr>
+                    <pic:cNvPr id="0" name="2551088649_d.jpg"/>
+                    <pic:cNvPicPr/>
+                  </pic:nvPicPr>
+                  <pic:blipFill>
+                    <a:blip r:embed="rId11"/>
+                    <a:stretch>
+                      <a:fillRect/>
+                    </a:stretch>
+                  </pic:blipFill>
+                  <pic:spPr>
+                    <a:xfrm>
+                      <a:off x="0" y="0"/>
+                      <a:ext cx="3436363" cy="2520000"/>
+                    </a:xfrm>
+                    <a:prstGeom prst="rect"/>
+                  </pic:spPr>
+                </pic:pic>
+              </a:graphicData>
+            </a:graphic>
+          </wp:inline>
+        </w:drawing>
+      </w:r>
     </w:p>
     <w:p>
       <w:pPr>
         <w:jc w:val="center"/>
-        <w:rPr>
-          <w:rFonts w:ascii="Times New Roman" w:hAnsi="Times New Roman" w:cs="Times New Roman"/>
-          <w:lang w:val="tr-TR"/>
-        </w:rPr>
       </w:pPr>
       <w:r>
         <w:rPr>
           <w:rFonts w:ascii="Times New Roman" w:hAnsi="Times New Roman" w:cs="Times New Roman"/>
           <w:b/>
           <w:bCs/>
-          <w:lang w:val="tr-TR"/>
-        </w:rPr>
-        <w:t xml:space="preserve">Tema görseli:</w:t>
-      </w:r>
-      <w:r>
-        <w:rPr>
-          <w:rFonts w:ascii="Times New Roman" w:hAnsi="Times New Roman" w:cs="Times New Roman"/>
-          <w:lang w:val="tr-TR"/>
-        </w:rPr>
-        <w:t xml:space="preserve"> Etkileşim</w:t>
-      </w:r>
-    </w:p>
-    <w:p>
-      <w:pPr>
-        <w:jc w:val="both"/>
+          <w:highlight w:val="yellow"/>
+          <w:lang w:val="tr-TR"/>
+        </w:rPr>
+        <w:t xml:space="preserve">Shutter id: 2551088649</w:t>
+      </w:r>
+    </w:p>
+    <w:p>
+      <w:pPr>
+        <w:jc w:val="center"/>
+        <w:rPr>
+          <w:rFonts w:ascii="Times New Roman" w:hAnsi="Times New Roman" w:cs="Times New Roman"/>
+          <w:lang w:val="tr-TR"/>
+        </w:rPr>
+      </w:pPr>
+      <w:r>
         <w:rPr>
           <w:rFonts w:ascii="Times New Roman" w:hAnsi="Times New Roman" w:cs="Times New Roman"/>
           <w:b/>
           <w:bCs/>
           <w:lang w:val="tr-TR"/>
         </w:rPr>
-      </w:pPr>
-      <w:r>
+        <w:t xml:space="preserve">Tema görseli:</w:t>
+      </w:r>
+      <w:r>
+        <w:rPr>
+          <w:rFonts w:ascii="Times New Roman" w:hAnsi="Times New Roman" w:cs="Times New Roman"/>
+          <w:lang w:val="tr-TR"/>
+        </w:rPr>
+        <w:t xml:space="preserve"> Etkileşim</w:t>
+      </w:r>
+    </w:p>
+    <w:p>
+      <w:pPr>
+        <w:jc w:val="both"/>
         <w:rPr>
           <w:rFonts w:ascii="Times New Roman" w:hAnsi="Times New Roman" w:cs="Times New Roman"/>
           <w:b/>
           <w:bCs/>
           <w:lang w:val="tr-TR"/>
         </w:rPr>
-        <w:t xml:space="preserve">Temanın Anahtar Kavramları</w:t>
-      </w:r>
-    </w:p>
-    <w:p>
-      <w:pPr>
-        <w:ind w:left="360"/>
-        <w:jc w:val="both"/>
-        <w:rPr>
-          <w:rFonts w:ascii="Times New Roman" w:hAnsi="Times New Roman" w:cs="Times New Roman"/>
-          <w:lang w:val="tr-TR"/>
-        </w:rPr>
-      </w:pPr>
-      <w:r>
-        <w:rPr>
-          <w:rFonts w:ascii="Times New Roman" w:hAnsi="Times New Roman" w:cs="Times New Roman"/>
-          <w:lang w:val="tr-TR"/>
-        </w:rPr>
-        <w:t xml:space="preserve">• Aktiflik</w:t>
-      </w:r>
-    </w:p>
-    <w:p>
-      <w:pPr>
-        <w:ind w:left="360"/>
-        <w:jc w:val="both"/>
-        <w:rPr>
-          <w:rFonts w:ascii="Times New Roman" w:hAnsi="Times New Roman" w:cs="Times New Roman"/>
-          <w:lang w:val="tr-TR"/>
-        </w:rPr>
-      </w:pPr>
-      <w:r>
-        <w:rPr>
-          <w:rFonts w:ascii="Times New Roman" w:hAnsi="Times New Roman" w:cs="Times New Roman"/>
-          <w:lang w:val="tr-TR"/>
-        </w:rPr>
-        <w:t xml:space="preserve">• Anot</w:t>
-      </w:r>
-    </w:p>
-    <w:p>
-      <w:pPr>
-        <w:ind w:left="360"/>
-        <w:jc w:val="both"/>
-        <w:rPr>
-          <w:rFonts w:ascii="Times New Roman" w:hAnsi="Times New Roman" w:cs="Times New Roman"/>
-          <w:lang w:val="tr-TR"/>
-        </w:rPr>
-      </w:pPr>
-      <w:r>
-        <w:rPr>
-          <w:rFonts w:ascii="Times New Roman" w:hAnsi="Times New Roman" w:cs="Times New Roman"/>
-          <w:lang w:val="tr-TR"/>
-        </w:rPr>
-        <w:t xml:space="preserve">• Elektrokimyasal hücre</w:t>
-      </w:r>
-    </w:p>
-    <w:p>
-      <w:pPr>
-        <w:ind w:left="360"/>
-        <w:jc w:val="both"/>
-        <w:rPr>
-          <w:rFonts w:ascii="Times New Roman" w:hAnsi="Times New Roman" w:cs="Times New Roman"/>
-          <w:lang w:val="tr-TR"/>
-        </w:rPr>
-      </w:pPr>
-      <w:r>
-        <w:rPr>
-          <w:rFonts w:ascii="Times New Roman" w:hAnsi="Times New Roman" w:cs="Times New Roman"/>
-          <w:lang w:val="tr-TR"/>
-        </w:rPr>
-        <w:t xml:space="preserve">• Elektrolit</w:t>
-      </w:r>
-    </w:p>
-    <w:p>
-      <w:pPr>
-        <w:ind w:left="360"/>
-        <w:jc w:val="both"/>
-        <w:rPr>
-          <w:rFonts w:ascii="Times New Roman" w:hAnsi="Times New Roman" w:cs="Times New Roman"/>
-          <w:lang w:val="tr-TR"/>
-        </w:rPr>
-      </w:pPr>
-      <w:r>
-        <w:rPr>
-          <w:rFonts w:ascii="Times New Roman" w:hAnsi="Times New Roman" w:cs="Times New Roman"/>
-          <w:lang w:val="tr-TR"/>
-        </w:rPr>
-        <w:t xml:space="preserve">• Elektrolitik hücre</w:t>
-      </w:r>
-    </w:p>
-    <w:p>
-      <w:pPr>
-        <w:ind w:left="360"/>
-        <w:jc w:val="both"/>
-        <w:rPr>
-          <w:rFonts w:ascii="Times New Roman" w:hAnsi="Times New Roman" w:cs="Times New Roman"/>
-          <w:lang w:val="tr-TR"/>
-        </w:rPr>
-      </w:pPr>
-      <w:r>
-        <w:rPr>
-          <w:rFonts w:ascii="Times New Roman" w:hAnsi="Times New Roman" w:cs="Times New Roman"/>
-          <w:lang w:val="tr-TR"/>
-        </w:rPr>
-        <w:t xml:space="preserve">• Elektroliz</w:t>
-      </w:r>
-    </w:p>
-    <w:p>
-      <w:pPr>
-        <w:ind w:left="360"/>
-        <w:jc w:val="both"/>
-        <w:rPr>
-          <w:rFonts w:ascii="Times New Roman" w:hAnsi="Times New Roman" w:cs="Times New Roman"/>
-          <w:lang w:val="tr-TR"/>
-        </w:rPr>
-      </w:pPr>
-      <w:r>
-        <w:rPr>
-          <w:rFonts w:ascii="Times New Roman" w:hAnsi="Times New Roman" w:cs="Times New Roman"/>
-          <w:lang w:val="tr-TR"/>
-        </w:rPr>
-        <w:t xml:space="preserve">• Elektrot</w:t>
-      </w:r>
-    </w:p>
-    <w:p>
-      <w:pPr>
-        <w:ind w:left="360"/>
-        <w:jc w:val="both"/>
-        <w:rPr>
-          <w:rFonts w:ascii="Times New Roman" w:hAnsi="Times New Roman" w:cs="Times New Roman"/>
-          <w:lang w:val="tr-TR"/>
-        </w:rPr>
-      </w:pPr>
-      <w:r>
-        <w:rPr>
-          <w:rFonts w:ascii="Times New Roman" w:hAnsi="Times New Roman" w:cs="Times New Roman"/>
-          <w:lang w:val="tr-TR"/>
-        </w:rPr>
-        <w:t xml:space="preserve">• Faraday yasaları</w:t>
-      </w:r>
-    </w:p>
-    <w:p>
-      <w:pPr>
-        <w:ind w:left="360"/>
-        <w:jc w:val="both"/>
-        <w:rPr>
-          <w:rFonts w:ascii="Times New Roman" w:hAnsi="Times New Roman" w:cs="Times New Roman"/>
-          <w:lang w:val="tr-TR"/>
-        </w:rPr>
-      </w:pPr>
-      <w:r>
-        <w:rPr>
-          <w:rFonts w:ascii="Times New Roman" w:hAnsi="Times New Roman" w:cs="Times New Roman"/>
-          <w:lang w:val="tr-TR"/>
-        </w:rPr>
-        <w:t xml:space="preserve">• Galvanik hücre</w:t>
-      </w:r>
-    </w:p>
-    <w:p>
-      <w:pPr>
-        <w:ind w:left="360"/>
-        <w:jc w:val="both"/>
-        <w:rPr>
-          <w:rFonts w:ascii="Times New Roman" w:hAnsi="Times New Roman" w:cs="Times New Roman"/>
-          <w:lang w:val="tr-TR"/>
-        </w:rPr>
-      </w:pPr>
-      <w:r>
-        <w:rPr>
-          <w:rFonts w:ascii="Times New Roman" w:hAnsi="Times New Roman" w:cs="Times New Roman"/>
-          <w:lang w:val="tr-TR"/>
-        </w:rPr>
-        <w:t xml:space="preserve">• İndirgen</w:t>
-      </w:r>
-    </w:p>
-    <w:p>
-      <w:pPr>
-        <w:ind w:left="360"/>
-        <w:jc w:val="both"/>
-        <w:rPr>
-          <w:rFonts w:ascii="Times New Roman" w:hAnsi="Times New Roman" w:cs="Times New Roman"/>
-          <w:lang w:val="tr-TR"/>
-        </w:rPr>
-      </w:pPr>
-      <w:r>
-        <w:rPr>
-          <w:rFonts w:ascii="Times New Roman" w:hAnsi="Times New Roman" w:cs="Times New Roman"/>
-          <w:lang w:val="tr-TR"/>
-        </w:rPr>
-        <w:t xml:space="preserve">• İndirgenme</w:t>
-      </w:r>
-    </w:p>
-    <w:p>
-      <w:pPr>
-        <w:ind w:left="360"/>
-        <w:jc w:val="both"/>
-        <w:rPr>
-          <w:rFonts w:ascii="Times New Roman" w:hAnsi="Times New Roman" w:cs="Times New Roman"/>
-          <w:lang w:val="tr-TR"/>
-        </w:rPr>
-      </w:pPr>
-      <w:r>
-        <w:rPr>
-          <w:rFonts w:ascii="Times New Roman" w:hAnsi="Times New Roman" w:cs="Times New Roman"/>
-          <w:lang w:val="tr-TR"/>
-        </w:rPr>
-        <w:t xml:space="preserve">• Katodik koruma</w:t>
-      </w:r>
-    </w:p>
-    <w:p>
-      <w:pPr>
-        <w:ind w:left="360"/>
-        <w:jc w:val="both"/>
-        <w:rPr>
-          <w:rFonts w:ascii="Times New Roman" w:hAnsi="Times New Roman" w:cs="Times New Roman"/>
-          <w:lang w:val="tr-TR"/>
-        </w:rPr>
-      </w:pPr>
-      <w:r>
-        <w:rPr>
-          <w:rFonts w:ascii="Times New Roman" w:hAnsi="Times New Roman" w:cs="Times New Roman"/>
-          <w:lang w:val="tr-TR"/>
-        </w:rPr>
-        <w:t xml:space="preserve">• Katot</w:t>
-      </w:r>
-    </w:p>
-    <w:p>
-      <w:pPr>
-        <w:ind w:left="360"/>
-        <w:jc w:val="both"/>
-        <w:rPr>
-          <w:rFonts w:ascii="Times New Roman" w:hAnsi="Times New Roman" w:cs="Times New Roman"/>
-          <w:lang w:val="tr-TR"/>
-        </w:rPr>
-      </w:pPr>
-      <w:r>
-        <w:rPr>
-          <w:rFonts w:ascii="Times New Roman" w:hAnsi="Times New Roman" w:cs="Times New Roman"/>
-          <w:lang w:val="tr-TR"/>
-        </w:rPr>
-        <w:t xml:space="preserve">• Korozyon</w:t>
-      </w:r>
-    </w:p>
-    <w:p>
-      <w:pPr>
-        <w:ind w:left="360"/>
-        <w:jc w:val="both"/>
-        <w:rPr>
-          <w:rFonts w:ascii="Times New Roman" w:hAnsi="Times New Roman" w:cs="Times New Roman"/>
-          <w:lang w:val="tr-TR"/>
-        </w:rPr>
-      </w:pPr>
-      <w:r>
-        <w:rPr>
-          <w:rFonts w:ascii="Times New Roman" w:hAnsi="Times New Roman" w:cs="Times New Roman"/>
-          <w:lang w:val="tr-TR"/>
-        </w:rPr>
-        <w:t xml:space="preserve">• Redoks</w:t>
-      </w:r>
-    </w:p>
-    <w:p>
-      <w:pPr>
-        <w:ind w:left="360"/>
-        <w:jc w:val="both"/>
-        <w:rPr>
-          <w:rFonts w:ascii="Times New Roman" w:hAnsi="Times New Roman" w:cs="Times New Roman"/>
-          <w:lang w:val="tr-TR"/>
-        </w:rPr>
-      </w:pPr>
-      <w:r>
-        <w:rPr>
-          <w:rFonts w:ascii="Times New Roman" w:hAnsi="Times New Roman" w:cs="Times New Roman"/>
-          <w:lang w:val="tr-TR"/>
-        </w:rPr>
-        <w:t xml:space="preserve">• Standart elektrot potansiyeli</w:t>
-      </w:r>
-    </w:p>
-    <w:p>
-      <w:pPr>
-        <w:ind w:left="360"/>
-        <w:jc w:val="both"/>
-        <w:rPr>
-          <w:rFonts w:ascii="Times New Roman" w:hAnsi="Times New Roman" w:cs="Times New Roman"/>
-          <w:lang w:val="tr-TR"/>
-        </w:rPr>
-      </w:pPr>
-      <w:r>
-        <w:rPr>
-          <w:rFonts w:ascii="Times New Roman" w:hAnsi="Times New Roman" w:cs="Times New Roman"/>
-          <w:lang w:val="tr-TR"/>
-        </w:rPr>
-        <w:t xml:space="preserve">• Tuz köprüsü</w:t>
-      </w:r>
-    </w:p>
-    <w:p>
-      <w:pPr>
-        <w:ind w:left="360"/>
-        <w:jc w:val="both"/>
-        <w:rPr>
-          <w:rFonts w:ascii="Times New Roman" w:hAnsi="Times New Roman" w:cs="Times New Roman"/>
-          <w:lang w:val="tr-TR"/>
-        </w:rPr>
-      </w:pPr>
-      <w:r>
-        <w:rPr>
-          <w:rFonts w:ascii="Times New Roman" w:hAnsi="Times New Roman" w:cs="Times New Roman"/>
-          <w:lang w:val="tr-TR"/>
-        </w:rPr>
-        <w:t xml:space="preserve">• Yarı hücre</w:t>
-      </w:r>
-    </w:p>
-    <w:p>
-      <w:pPr>
-        <w:ind w:left="360"/>
-        <w:jc w:val="both"/>
-        <w:rPr>
-          <w:rFonts w:ascii="Times New Roman" w:hAnsi="Times New Roman" w:cs="Times New Roman"/>
-          <w:lang w:val="tr-TR"/>
-        </w:rPr>
-      </w:pPr>
-      <w:r>
-        <w:rPr>
-          <w:rFonts w:ascii="Times New Roman" w:hAnsi="Times New Roman" w:cs="Times New Roman"/>
-          <w:lang w:val="tr-TR"/>
-        </w:rPr>
-        <w:t xml:space="preserve">• Yükseltgen</w:t>
-      </w:r>
-    </w:p>
-    <w:p>
-      <w:pPr>
-        <w:ind w:left="360"/>
-        <w:jc w:val="both"/>
-        <w:rPr>
-          <w:rFonts w:ascii="Times New Roman" w:hAnsi="Times New Roman" w:cs="Times New Roman"/>
-          <w:lang w:val="tr-TR"/>
-        </w:rPr>
-      </w:pPr>
-      <w:r>
-        <w:rPr>
-          <w:rFonts w:ascii="Times New Roman" w:hAnsi="Times New Roman" w:cs="Times New Roman"/>
-          <w:lang w:val="tr-TR"/>
-        </w:rPr>
-        <w:t xml:space="preserve">• Yükseltgenme</w:t>
-      </w:r>
-    </w:p>
-    <w:p>
-      <w:pPr>
-        <w:jc w:val="both"/>
+      </w:pPr>
+      <w:r>
         <w:rPr>
           <w:rFonts w:ascii="Times New Roman" w:hAnsi="Times New Roman" w:cs="Times New Roman"/>
           <w:b/>
           <w:bCs/>
           <w:lang w:val="tr-TR"/>
         </w:rPr>
-      </w:pPr>
-      <w:r>
+        <w:t xml:space="preserve">Temanın Anahtar Kavramları</w:t>
+      </w:r>
+    </w:p>
+    <w:p>
+      <w:pPr>
+        <w:ind w:left="360"/>
+        <w:jc w:val="both"/>
+        <w:rPr>
+          <w:rFonts w:ascii="Times New Roman" w:hAnsi="Times New Roman" w:cs="Times New Roman"/>
+          <w:lang w:val="tr-TR"/>
+        </w:rPr>
+      </w:pPr>
+      <w:r>
+        <w:rPr>
+          <w:rFonts w:ascii="Times New Roman" w:hAnsi="Times New Roman" w:cs="Times New Roman"/>
+          <w:lang w:val="tr-TR"/>
+        </w:rPr>
+        <w:t xml:space="preserve">• Aktiflik</w:t>
+      </w:r>
+    </w:p>
+    <w:p>
+      <w:pPr>
+        <w:ind w:left="360"/>
+        <w:jc w:val="both"/>
+        <w:rPr>
+          <w:rFonts w:ascii="Times New Roman" w:hAnsi="Times New Roman" w:cs="Times New Roman"/>
+          <w:lang w:val="tr-TR"/>
+        </w:rPr>
+      </w:pPr>
+      <w:r>
+        <w:rPr>
+          <w:rFonts w:ascii="Times New Roman" w:hAnsi="Times New Roman" w:cs="Times New Roman"/>
+          <w:lang w:val="tr-TR"/>
+        </w:rPr>
+        <w:t xml:space="preserve">• Anot</w:t>
+      </w:r>
+    </w:p>
+    <w:p>
+      <w:pPr>
+        <w:ind w:left="360"/>
+        <w:jc w:val="both"/>
+        <w:rPr>
+          <w:rFonts w:ascii="Times New Roman" w:hAnsi="Times New Roman" w:cs="Times New Roman"/>
+          <w:lang w:val="tr-TR"/>
+        </w:rPr>
+      </w:pPr>
+      <w:r>
+        <w:rPr>
+          <w:rFonts w:ascii="Times New Roman" w:hAnsi="Times New Roman" w:cs="Times New Roman"/>
+          <w:lang w:val="tr-TR"/>
+        </w:rPr>
+        <w:t xml:space="preserve">• Elektrokimyasal hücre</w:t>
+      </w:r>
+    </w:p>
+    <w:p>
+      <w:pPr>
+        <w:ind w:left="360"/>
+        <w:jc w:val="both"/>
+        <w:rPr>
+          <w:rFonts w:ascii="Times New Roman" w:hAnsi="Times New Roman" w:cs="Times New Roman"/>
+          <w:lang w:val="tr-TR"/>
+        </w:rPr>
+      </w:pPr>
+      <w:r>
+        <w:rPr>
+          <w:rFonts w:ascii="Times New Roman" w:hAnsi="Times New Roman" w:cs="Times New Roman"/>
+          <w:lang w:val="tr-TR"/>
+        </w:rPr>
+        <w:t xml:space="preserve">• Elektrolit</w:t>
+      </w:r>
+    </w:p>
+    <w:p>
+      <w:pPr>
+        <w:ind w:left="360"/>
+        <w:jc w:val="both"/>
+        <w:rPr>
+          <w:rFonts w:ascii="Times New Roman" w:hAnsi="Times New Roman" w:cs="Times New Roman"/>
+          <w:lang w:val="tr-TR"/>
+        </w:rPr>
+      </w:pPr>
+      <w:r>
+        <w:rPr>
+          <w:rFonts w:ascii="Times New Roman" w:hAnsi="Times New Roman" w:cs="Times New Roman"/>
+          <w:lang w:val="tr-TR"/>
+        </w:rPr>
+        <w:t xml:space="preserve">• Elektrolitik hücre</w:t>
+      </w:r>
+    </w:p>
+    <w:p>
+      <w:pPr>
+        <w:ind w:left="360"/>
+        <w:jc w:val="both"/>
+        <w:rPr>
+          <w:rFonts w:ascii="Times New Roman" w:hAnsi="Times New Roman" w:cs="Times New Roman"/>
+          <w:lang w:val="tr-TR"/>
+        </w:rPr>
+      </w:pPr>
+      <w:r>
+        <w:rPr>
+          <w:rFonts w:ascii="Times New Roman" w:hAnsi="Times New Roman" w:cs="Times New Roman"/>
+          <w:lang w:val="tr-TR"/>
+        </w:rPr>
+        <w:t xml:space="preserve">• Elektroliz</w:t>
+      </w:r>
+    </w:p>
+    <w:p>
+      <w:pPr>
+        <w:ind w:left="360"/>
+        <w:jc w:val="both"/>
+        <w:rPr>
+          <w:rFonts w:ascii="Times New Roman" w:hAnsi="Times New Roman" w:cs="Times New Roman"/>
+          <w:lang w:val="tr-TR"/>
+        </w:rPr>
+      </w:pPr>
+      <w:r>
+        <w:rPr>
+          <w:rFonts w:ascii="Times New Roman" w:hAnsi="Times New Roman" w:cs="Times New Roman"/>
+          <w:lang w:val="tr-TR"/>
+        </w:rPr>
+        <w:t xml:space="preserve">• Elektrot</w:t>
+      </w:r>
+    </w:p>
+    <w:p>
+      <w:pPr>
+        <w:ind w:left="360"/>
+        <w:jc w:val="both"/>
+        <w:rPr>
+          <w:rFonts w:ascii="Times New Roman" w:hAnsi="Times New Roman" w:cs="Times New Roman"/>
+          <w:lang w:val="tr-TR"/>
+        </w:rPr>
+      </w:pPr>
+      <w:r>
+        <w:rPr>
+          <w:rFonts w:ascii="Times New Roman" w:hAnsi="Times New Roman" w:cs="Times New Roman"/>
+          <w:lang w:val="tr-TR"/>
+        </w:rPr>
+        <w:t xml:space="preserve">• Faraday yasaları</w:t>
+      </w:r>
+    </w:p>
+    <w:p>
+      <w:pPr>
+        <w:ind w:left="360"/>
+        <w:jc w:val="both"/>
+        <w:rPr>
+          <w:rFonts w:ascii="Times New Roman" w:hAnsi="Times New Roman" w:cs="Times New Roman"/>
+          <w:lang w:val="tr-TR"/>
+        </w:rPr>
+      </w:pPr>
+      <w:r>
+        <w:rPr>
+          <w:rFonts w:ascii="Times New Roman" w:hAnsi="Times New Roman" w:cs="Times New Roman"/>
+          <w:lang w:val="tr-TR"/>
+        </w:rPr>
+        <w:t xml:space="preserve">• Galvanik hücre</w:t>
+      </w:r>
+    </w:p>
+    <w:p>
+      <w:pPr>
+        <w:ind w:left="360"/>
+        <w:jc w:val="both"/>
+        <w:rPr>
+          <w:rFonts w:ascii="Times New Roman" w:hAnsi="Times New Roman" w:cs="Times New Roman"/>
+          <w:lang w:val="tr-TR"/>
+        </w:rPr>
+      </w:pPr>
+      <w:r>
+        <w:rPr>
+          <w:rFonts w:ascii="Times New Roman" w:hAnsi="Times New Roman" w:cs="Times New Roman"/>
+          <w:lang w:val="tr-TR"/>
+        </w:rPr>
+        <w:t xml:space="preserve">• İndirgen</w:t>
+      </w:r>
+    </w:p>
+    <w:p>
+      <w:pPr>
+        <w:ind w:left="360"/>
+        <w:jc w:val="both"/>
+        <w:rPr>
+          <w:rFonts w:ascii="Times New Roman" w:hAnsi="Times New Roman" w:cs="Times New Roman"/>
+          <w:lang w:val="tr-TR"/>
+        </w:rPr>
+      </w:pPr>
+      <w:r>
+        <w:rPr>
+          <w:rFonts w:ascii="Times New Roman" w:hAnsi="Times New Roman" w:cs="Times New Roman"/>
+          <w:lang w:val="tr-TR"/>
+        </w:rPr>
+        <w:t xml:space="preserve">• İndirgenme</w:t>
+      </w:r>
+    </w:p>
+    <w:p>
+      <w:pPr>
+        <w:ind w:left="360"/>
+        <w:jc w:val="both"/>
+        <w:rPr>
+          <w:rFonts w:ascii="Times New Roman" w:hAnsi="Times New Roman" w:cs="Times New Roman"/>
+          <w:lang w:val="tr-TR"/>
+        </w:rPr>
+      </w:pPr>
+      <w:r>
+        <w:rPr>
+          <w:rFonts w:ascii="Times New Roman" w:hAnsi="Times New Roman" w:cs="Times New Roman"/>
+          <w:lang w:val="tr-TR"/>
+        </w:rPr>
+        <w:t xml:space="preserve">• Katodik koruma</w:t>
+      </w:r>
+    </w:p>
+    <w:p>
+      <w:pPr>
+        <w:ind w:left="360"/>
+        <w:jc w:val="both"/>
+        <w:rPr>
+          <w:rFonts w:ascii="Times New Roman" w:hAnsi="Times New Roman" w:cs="Times New Roman"/>
+          <w:lang w:val="tr-TR"/>
+        </w:rPr>
+      </w:pPr>
+      <w:r>
+        <w:rPr>
+          <w:rFonts w:ascii="Times New Roman" w:hAnsi="Times New Roman" w:cs="Times New Roman"/>
+          <w:lang w:val="tr-TR"/>
+        </w:rPr>
+        <w:t xml:space="preserve">• Katot</w:t>
+      </w:r>
+    </w:p>
+    <w:p>
+      <w:pPr>
+        <w:ind w:left="360"/>
+        <w:jc w:val="both"/>
+        <w:rPr>
+          <w:rFonts w:ascii="Times New Roman" w:hAnsi="Times New Roman" w:cs="Times New Roman"/>
+          <w:lang w:val="tr-TR"/>
+        </w:rPr>
+      </w:pPr>
+      <w:r>
+        <w:rPr>
+          <w:rFonts w:ascii="Times New Roman" w:hAnsi="Times New Roman" w:cs="Times New Roman"/>
+          <w:lang w:val="tr-TR"/>
+        </w:rPr>
+        <w:t xml:space="preserve">• Korozyon</w:t>
+      </w:r>
+    </w:p>
+    <w:p>
+      <w:pPr>
+        <w:ind w:left="360"/>
+        <w:jc w:val="both"/>
+        <w:rPr>
+          <w:rFonts w:ascii="Times New Roman" w:hAnsi="Times New Roman" w:cs="Times New Roman"/>
+          <w:lang w:val="tr-TR"/>
+        </w:rPr>
+      </w:pPr>
+      <w:r>
+        <w:rPr>
+          <w:rFonts w:ascii="Times New Roman" w:hAnsi="Times New Roman" w:cs="Times New Roman"/>
+          <w:lang w:val="tr-TR"/>
+        </w:rPr>
+        <w:t xml:space="preserve">• Redoks</w:t>
+      </w:r>
+    </w:p>
+    <w:p>
+      <w:pPr>
+        <w:ind w:left="360"/>
+        <w:jc w:val="both"/>
+        <w:rPr>
+          <w:rFonts w:ascii="Times New Roman" w:hAnsi="Times New Roman" w:cs="Times New Roman"/>
+          <w:lang w:val="tr-TR"/>
+        </w:rPr>
+      </w:pPr>
+      <w:r>
+        <w:rPr>
+          <w:rFonts w:ascii="Times New Roman" w:hAnsi="Times New Roman" w:cs="Times New Roman"/>
+          <w:lang w:val="tr-TR"/>
+        </w:rPr>
+        <w:t xml:space="preserve">• Standart elektrot potansiyeli</w:t>
+      </w:r>
+    </w:p>
+    <w:p>
+      <w:pPr>
+        <w:ind w:left="360"/>
+        <w:jc w:val="both"/>
+        <w:rPr>
+          <w:rFonts w:ascii="Times New Roman" w:hAnsi="Times New Roman" w:cs="Times New Roman"/>
+          <w:lang w:val="tr-TR"/>
+        </w:rPr>
+      </w:pPr>
+      <w:r>
+        <w:rPr>
+          <w:rFonts w:ascii="Times New Roman" w:hAnsi="Times New Roman" w:cs="Times New Roman"/>
+          <w:lang w:val="tr-TR"/>
+        </w:rPr>
+        <w:t xml:space="preserve">• Tuz köprüsü</w:t>
+      </w:r>
+    </w:p>
+    <w:p>
+      <w:pPr>
+        <w:ind w:left="360"/>
+        <w:jc w:val="both"/>
+        <w:rPr>
+          <w:rFonts w:ascii="Times New Roman" w:hAnsi="Times New Roman" w:cs="Times New Roman"/>
+          <w:lang w:val="tr-TR"/>
+        </w:rPr>
+      </w:pPr>
+      <w:r>
+        <w:rPr>
+          <w:rFonts w:ascii="Times New Roman" w:hAnsi="Times New Roman" w:cs="Times New Roman"/>
+          <w:lang w:val="tr-TR"/>
+        </w:rPr>
+        <w:t xml:space="preserve">• Yarı hücre</w:t>
+      </w:r>
+    </w:p>
+    <w:p>
+      <w:pPr>
+        <w:ind w:left="360"/>
+        <w:jc w:val="both"/>
+        <w:rPr>
+          <w:rFonts w:ascii="Times New Roman" w:hAnsi="Times New Roman" w:cs="Times New Roman"/>
+          <w:lang w:val="tr-TR"/>
+        </w:rPr>
+      </w:pPr>
+      <w:r>
+        <w:rPr>
+          <w:rFonts w:ascii="Times New Roman" w:hAnsi="Times New Roman" w:cs="Times New Roman"/>
+          <w:lang w:val="tr-TR"/>
+        </w:rPr>
+        <w:t xml:space="preserve">• Yükseltgen</w:t>
+      </w:r>
+    </w:p>
+    <w:p>
+      <w:pPr>
+        <w:ind w:left="360"/>
+        <w:jc w:val="both"/>
+        <w:rPr>
+          <w:rFonts w:ascii="Times New Roman" w:hAnsi="Times New Roman" w:cs="Times New Roman"/>
+          <w:lang w:val="tr-TR"/>
+        </w:rPr>
+      </w:pPr>
+      <w:r>
+        <w:rPr>
+          <w:rFonts w:ascii="Times New Roman" w:hAnsi="Times New Roman" w:cs="Times New Roman"/>
+          <w:lang w:val="tr-TR"/>
+        </w:rPr>
+        <w:t xml:space="preserve">• Yükseltgenme</w:t>
+      </w:r>
+    </w:p>
+    <w:p>
+      <w:pPr>
+        <w:jc w:val="both"/>
         <w:rPr>
           <w:rFonts w:ascii="Times New Roman" w:hAnsi="Times New Roman" w:cs="Times New Roman"/>
           <w:b/>
           <w:bCs/>
           <w:lang w:val="tr-TR"/>
         </w:rPr>
-        <w:t xml:space="preserve">Bu Temada Neler Öğreneceksiniz?</w:t>
-      </w:r>
-    </w:p>
-    <w:p>
-      <w:pPr>
-        <w:ind w:left="360"/>
-        <w:jc w:val="both"/>
-        <w:rPr>
-          <w:rFonts w:ascii="Times New Roman" w:hAnsi="Times New Roman" w:cs="Times New Roman"/>
-          <w:lang w:val="tr-TR"/>
-        </w:rPr>
-      </w:pPr>
-      <w:r>
-        <w:rPr>
-          <w:rFonts w:ascii="Times New Roman" w:hAnsi="Times New Roman" w:cs="Times New Roman"/>
-          <w:lang w:val="tr-TR"/>
-        </w:rPr>
-        <w:t xml:space="preserve">• İndirgenme-yükseltgenme (redoks) tepkimelerinin oluşum sürecine ilişkin bilimsel gözlem yapacaksınız.</w:t>
-      </w:r>
-    </w:p>
-    <w:p>
-      <w:pPr>
-        <w:ind w:left="360"/>
-        <w:jc w:val="both"/>
-        <w:rPr>
-          <w:rFonts w:ascii="Times New Roman" w:hAnsi="Times New Roman" w:cs="Times New Roman"/>
-          <w:lang w:val="tr-TR"/>
-        </w:rPr>
-      </w:pPr>
-      <w:r>
-        <w:rPr>
-          <w:rFonts w:ascii="Times New Roman" w:hAnsi="Times New Roman" w:cs="Times New Roman"/>
-          <w:lang w:val="tr-TR"/>
-        </w:rPr>
-        <w:t xml:space="preserve">• Metallerin aktiflik sıralamasını belirlemek için bilimsel sorgulama yapacaksınız.</w:t>
-      </w:r>
-    </w:p>
-    <w:p>
-      <w:pPr>
-        <w:ind w:left="360"/>
-        <w:jc w:val="both"/>
-        <w:rPr>
-          <w:rFonts w:ascii="Times New Roman" w:hAnsi="Times New Roman" w:cs="Times New Roman"/>
-          <w:lang w:val="tr-TR"/>
-        </w:rPr>
-      </w:pPr>
-      <w:r>
-        <w:rPr>
-          <w:rFonts w:ascii="Times New Roman" w:hAnsi="Times New Roman" w:cs="Times New Roman"/>
-          <w:lang w:val="tr-TR"/>
-        </w:rPr>
-        <w:t xml:space="preserve">• Galvanik bir hücrenin özelliklerini bilimsel gözleme dayalı tahmin edeceksiniz.</w:t>
-      </w:r>
-    </w:p>
-    <w:p>
-      <w:pPr>
-        <w:ind w:left="360"/>
-        <w:jc w:val="both"/>
-        <w:rPr>
-          <w:rFonts w:ascii="Times New Roman" w:hAnsi="Times New Roman" w:cs="Times New Roman"/>
-          <w:lang w:val="tr-TR"/>
-        </w:rPr>
-      </w:pPr>
-      <w:r>
-        <w:rPr>
-          <w:rFonts w:ascii="Times New Roman" w:hAnsi="Times New Roman" w:cs="Times New Roman"/>
-          <w:lang w:val="tr-TR"/>
-        </w:rPr>
-        <w:t xml:space="preserve">• Standart hücre potansiyelinin hesaplanmasına ilişkin tümevarımsal akıl yürüteceksiniz.</w:t>
-      </w:r>
-    </w:p>
-    <w:p>
-      <w:pPr>
-        <w:ind w:left="360"/>
-        <w:jc w:val="both"/>
-        <w:rPr>
-          <w:rFonts w:ascii="Times New Roman" w:hAnsi="Times New Roman" w:cs="Times New Roman"/>
-          <w:lang w:val="tr-TR"/>
-        </w:rPr>
-      </w:pPr>
-      <w:r>
-        <w:rPr>
-          <w:rFonts w:ascii="Times New Roman" w:hAnsi="Times New Roman" w:cs="Times New Roman"/>
-          <w:lang w:val="tr-TR"/>
-        </w:rPr>
-        <w:t xml:space="preserve">• Galvanik hücrelerin potansiyelini etkileyen faktörlere ilişkin hipotez oluşturacaksınız.</w:t>
-      </w:r>
-    </w:p>
-    <w:p>
-      <w:pPr>
-        <w:ind w:left="360"/>
-        <w:jc w:val="both"/>
-        <w:rPr>
-          <w:rFonts w:ascii="Times New Roman" w:hAnsi="Times New Roman" w:cs="Times New Roman"/>
-          <w:lang w:val="tr-TR"/>
-        </w:rPr>
-      </w:pPr>
-      <w:r>
-        <w:rPr>
-          <w:rFonts w:ascii="Times New Roman" w:hAnsi="Times New Roman" w:cs="Times New Roman"/>
-          <w:lang w:val="tr-TR"/>
-        </w:rPr>
-        <w:t xml:space="preserve">• Elektrolitik bir hücrenin özelliklerini bilimsel gözlemlere dayalı tahmin edeceksiniz.</w:t>
-      </w:r>
-    </w:p>
-    <w:p>
-      <w:pPr>
-        <w:ind w:left="360"/>
-        <w:jc w:val="both"/>
-        <w:rPr>
-          <w:rFonts w:ascii="Times New Roman" w:hAnsi="Times New Roman" w:cs="Times New Roman"/>
-          <w:lang w:val="tr-TR"/>
-        </w:rPr>
-      </w:pPr>
-      <w:r>
-        <w:rPr>
-          <w:rFonts w:ascii="Times New Roman" w:hAnsi="Times New Roman" w:cs="Times New Roman"/>
-          <w:lang w:val="tr-TR"/>
-        </w:rPr>
-        <w:t xml:space="preserve">• Elektroliz olayında madde miktarı ile elektrik akımı miktarı arasındaki ilişkiyi açıklamak için kanıt kullanacaksınız.</w:t>
-      </w:r>
-    </w:p>
-    <w:p>
-      <w:pPr>
-        <w:ind w:left="360"/>
-        <w:jc w:val="both"/>
-        <w:rPr>
-          <w:rFonts w:ascii="Times New Roman" w:hAnsi="Times New Roman" w:cs="Times New Roman"/>
-          <w:lang w:val="tr-TR"/>
-        </w:rPr>
-      </w:pPr>
-      <w:r>
-        <w:rPr>
-          <w:rFonts w:ascii="Times New Roman" w:hAnsi="Times New Roman" w:cs="Times New Roman"/>
-          <w:lang w:val="tr-TR"/>
-        </w:rPr>
-        <w:t xml:space="preserve">• Metallerin elektrolizle kaplanmasına yönelik deney yapacaksınız.</w:t>
-      </w:r>
-    </w:p>
-    <w:p>
-      <w:pPr>
-        <w:ind w:left="360"/>
-        <w:jc w:val="both"/>
-        <w:rPr>
-          <w:rFonts w:ascii="Times New Roman" w:hAnsi="Times New Roman" w:cs="Times New Roman"/>
-          <w:lang w:val="tr-TR"/>
-        </w:rPr>
-      </w:pPr>
-      <w:r>
-        <w:rPr>
-          <w:rFonts w:ascii="Times New Roman" w:hAnsi="Times New Roman" w:cs="Times New Roman"/>
-          <w:lang w:val="tr-TR"/>
-        </w:rPr>
-        <w:t xml:space="preserve">• Korozyonu önlemeye yönelik bilimsel sorgulama yapacaksınız.</w:t>
-      </w:r>
-    </w:p>
-    <w:p>
-      <w:pPr>
-        <w:jc w:val="both"/>
+      </w:pPr>
+      <w:r>
         <w:rPr>
           <w:rFonts w:ascii="Times New Roman" w:hAnsi="Times New Roman" w:cs="Times New Roman"/>
           <w:b/>
           <w:bCs/>
           <w:lang w:val="tr-TR"/>
         </w:rPr>
-      </w:pPr>
-      <w:r>
+        <w:t xml:space="preserve">Bu Temada Neler Öğreneceksiniz?</w:t>
+      </w:r>
+    </w:p>
+    <w:p>
+      <w:pPr>
+        <w:ind w:left="360"/>
+        <w:jc w:val="both"/>
+        <w:rPr>
+          <w:rFonts w:ascii="Times New Roman" w:hAnsi="Times New Roman" w:cs="Times New Roman"/>
+          <w:lang w:val="tr-TR"/>
+        </w:rPr>
+      </w:pPr>
+      <w:r>
+        <w:rPr>
+          <w:rFonts w:ascii="Times New Roman" w:hAnsi="Times New Roman" w:cs="Times New Roman"/>
+          <w:lang w:val="tr-TR"/>
+        </w:rPr>
+        <w:t xml:space="preserve">• İndirgenme-yükseltgenme (redoks) tepkimelerinin oluşum sürecine ilişkin bilimsel gözlem yapacaksınız.</w:t>
+      </w:r>
+    </w:p>
+    <w:p>
+      <w:pPr>
+        <w:ind w:left="360"/>
+        <w:jc w:val="both"/>
+        <w:rPr>
+          <w:rFonts w:ascii="Times New Roman" w:hAnsi="Times New Roman" w:cs="Times New Roman"/>
+          <w:lang w:val="tr-TR"/>
+        </w:rPr>
+      </w:pPr>
+      <w:r>
+        <w:rPr>
+          <w:rFonts w:ascii="Times New Roman" w:hAnsi="Times New Roman" w:cs="Times New Roman"/>
+          <w:lang w:val="tr-TR"/>
+        </w:rPr>
+        <w:t xml:space="preserve">• Metallerin aktiflik sıralamasını belirlemek için bilimsel sorgulama yapacaksınız.</w:t>
+      </w:r>
+    </w:p>
+    <w:p>
+      <w:pPr>
+        <w:ind w:left="360"/>
+        <w:jc w:val="both"/>
+        <w:rPr>
+          <w:rFonts w:ascii="Times New Roman" w:hAnsi="Times New Roman" w:cs="Times New Roman"/>
+          <w:lang w:val="tr-TR"/>
+        </w:rPr>
+      </w:pPr>
+      <w:r>
+        <w:rPr>
+          <w:rFonts w:ascii="Times New Roman" w:hAnsi="Times New Roman" w:cs="Times New Roman"/>
+          <w:lang w:val="tr-TR"/>
+        </w:rPr>
+        <w:t xml:space="preserve">• Galvanik bir hücrenin özelliklerini bilimsel gözleme dayalı tahmin edeceksiniz.</w:t>
+      </w:r>
+    </w:p>
+    <w:p>
+      <w:pPr>
+        <w:ind w:left="360"/>
+        <w:jc w:val="both"/>
+        <w:rPr>
+          <w:rFonts w:ascii="Times New Roman" w:hAnsi="Times New Roman" w:cs="Times New Roman"/>
+          <w:lang w:val="tr-TR"/>
+        </w:rPr>
+      </w:pPr>
+      <w:r>
+        <w:rPr>
+          <w:rFonts w:ascii="Times New Roman" w:hAnsi="Times New Roman" w:cs="Times New Roman"/>
+          <w:lang w:val="tr-TR"/>
+        </w:rPr>
+        <w:t xml:space="preserve">• Standart hücre potansiyelinin hesaplanmasına ilişkin tümevarımsal akıl yürüteceksiniz.</w:t>
+      </w:r>
+    </w:p>
+    <w:p>
+      <w:pPr>
+        <w:ind w:left="360"/>
+        <w:jc w:val="both"/>
+        <w:rPr>
+          <w:rFonts w:ascii="Times New Roman" w:hAnsi="Times New Roman" w:cs="Times New Roman"/>
+          <w:lang w:val="tr-TR"/>
+        </w:rPr>
+      </w:pPr>
+      <w:r>
+        <w:rPr>
+          <w:rFonts w:ascii="Times New Roman" w:hAnsi="Times New Roman" w:cs="Times New Roman"/>
+          <w:lang w:val="tr-TR"/>
+        </w:rPr>
+        <w:t xml:space="preserve">• Galvanik hücrelerin potansiyelini etkileyen faktörlere ilişkin hipotez oluşturacaksınız.</w:t>
+      </w:r>
+    </w:p>
+    <w:p>
+      <w:pPr>
+        <w:ind w:left="360"/>
+        <w:jc w:val="both"/>
+        <w:rPr>
+          <w:rFonts w:ascii="Times New Roman" w:hAnsi="Times New Roman" w:cs="Times New Roman"/>
+          <w:lang w:val="tr-TR"/>
+        </w:rPr>
+      </w:pPr>
+      <w:r>
+        <w:rPr>
+          <w:rFonts w:ascii="Times New Roman" w:hAnsi="Times New Roman" w:cs="Times New Roman"/>
+          <w:lang w:val="tr-TR"/>
+        </w:rPr>
+        <w:t xml:space="preserve">• Elektrolitik bir hücrenin özelliklerini bilimsel gözlemlere dayalı tahmin edeceksiniz.</w:t>
+      </w:r>
+    </w:p>
+    <w:p>
+      <w:pPr>
+        <w:ind w:left="360"/>
+        <w:jc w:val="both"/>
+        <w:rPr>
+          <w:rFonts w:ascii="Times New Roman" w:hAnsi="Times New Roman" w:cs="Times New Roman"/>
+          <w:lang w:val="tr-TR"/>
+        </w:rPr>
+      </w:pPr>
+      <w:r>
+        <w:rPr>
+          <w:rFonts w:ascii="Times New Roman" w:hAnsi="Times New Roman" w:cs="Times New Roman"/>
+          <w:lang w:val="tr-TR"/>
+        </w:rPr>
+        <w:t xml:space="preserve">• Elektroliz olayında madde miktarı ile elektrik akımı miktarı arasındaki ilişkiyi açıklamak için kanıt kullanacaksınız.</w:t>
+      </w:r>
+    </w:p>
+    <w:p>
+      <w:pPr>
+        <w:ind w:left="360"/>
+        <w:jc w:val="both"/>
+        <w:rPr>
+          <w:rFonts w:ascii="Times New Roman" w:hAnsi="Times New Roman" w:cs="Times New Roman"/>
+          <w:lang w:val="tr-TR"/>
+        </w:rPr>
+      </w:pPr>
+      <w:r>
+        <w:rPr>
+          <w:rFonts w:ascii="Times New Roman" w:hAnsi="Times New Roman" w:cs="Times New Roman"/>
+          <w:lang w:val="tr-TR"/>
+        </w:rPr>
+        <w:t xml:space="preserve">• Metallerin elektrolizle kaplanmasına yönelik deney yapacaksınız.</w:t>
+      </w:r>
+    </w:p>
+    <w:p>
+      <w:pPr>
+        <w:ind w:left="360"/>
+        <w:jc w:val="both"/>
+        <w:rPr>
+          <w:rFonts w:ascii="Times New Roman" w:hAnsi="Times New Roman" w:cs="Times New Roman"/>
+          <w:lang w:val="tr-TR"/>
+        </w:rPr>
+      </w:pPr>
+      <w:r>
+        <w:rPr>
+          <w:rFonts w:ascii="Times New Roman" w:hAnsi="Times New Roman" w:cs="Times New Roman"/>
+          <w:lang w:val="tr-TR"/>
+        </w:rPr>
+        <w:t xml:space="preserve">• Korozyonu önlemeye yönelik bilimsel sorgulama yapacaksınız.</w:t>
+      </w:r>
+    </w:p>
+    <w:p>
+      <w:pPr>
+        <w:jc w:val="both"/>
         <w:rPr>
           <w:rFonts w:ascii="Times New Roman" w:hAnsi="Times New Roman" w:cs="Times New Roman"/>
           <w:b/>
           <w:bCs/>
           <w:lang w:val="tr-TR"/>
         </w:rPr>
+      </w:pPr>
+      <w:r>
+        <w:rPr>
+          <w:rFonts w:ascii="Times New Roman" w:hAnsi="Times New Roman" w:cs="Times New Roman"/>
+          <w:b/>
+          <w:bCs/>
+          <w:lang w:val="tr-TR"/>
+        </w:rPr>
         <w:t xml:space="preserve">BÖLÜM: İndirgenme-Yükseltgenme Tepkimeleri</w:t>
       </w:r>
     </w:p>
-    <w:tbl>
-      <w:tblPr>
-        <w:tblW w:w="9000" w:type="dxa"/>
+    <w:p>
+      <w:pPr>
         <w:jc w:val="center"/>
-        <w:tblBorders>
-          <w:top w:val="single" w:sz="8" w:space="0" w:color="7F7F7F"/>
-          <w:left w:val="single" w:sz="8" w:space="0" w:color="7F7F7F"/>
-          <w:bottom w:val="single" w:sz="8" w:space="0" w:color="7F7F7F"/>
-          <w:right w:val="single" w:sz="8" w:space="0" w:color="7F7F7F"/>
-        </w:tblBorders>
-      </w:tblPr>
-      <w:tblGrid>
-        <w:gridCol w:w="9000"/>
-      </w:tblGrid>
-      <w:tr>
-        <w:tc>
-          <w:tcPr>
-            <w:tcW w:w="9000" w:type="dxa"/>
-            <w:shd w:val="clear" w:color="auto" w:fill="EDEDED"/>
-          </w:tcPr>
-          <w:p>
-            <w:pPr>
-              <w:jc w:val="both"/>
-              <w:rPr>
-                <w:rFonts w:ascii="Times New Roman" w:hAnsi="Times New Roman" w:cs="Times New Roman"/>
-                <w:lang w:val="tr-TR"/>
-              </w:rPr>
-            </w:pPr>
-            <w:r>
-              <w:rPr>
-                <w:rFonts w:ascii="Times New Roman" w:hAnsi="Times New Roman" w:cs="Times New Roman"/>
-                <w:lang w:val="tr-TR"/>
-              </w:rPr>
-              <w:t xml:space="preserve">GÖRSEL ALANI (Bölüm kapağı, tam sayfa; Shutterstock)</w:t>
-            </w:r>
-          </w:p>
-          <w:p>
-            <w:pPr>
-              <w:jc w:val="both"/>
-              <w:rPr>
-                <w:rFonts w:ascii="Times New Roman" w:hAnsi="Times New Roman" w:cs="Times New Roman"/>
-                <w:lang w:val="tr-TR"/>
-              </w:rPr>
-            </w:pPr>
-            <w:r>
-              <w:rPr>
-                <w:rFonts w:ascii="Times New Roman" w:hAnsi="Times New Roman" w:cs="Times New Roman"/>
-                <w:lang w:val="tr-TR"/>
-              </w:rPr>
-              <w:t xml:space="preserve">Tarif: Gece gökyüzünde parlak beyaz ve renkli ışıklar saçan havai fişek gösterisi; ön planda su yüzeyine yansıyan ışıklar (tam sayfa bölüm kapağı).</w:t>
-            </w:r>
-          </w:p>
-          <w:p>
-            <w:pPr>
-              <w:jc w:val="both"/>
-              <w:rPr>
-                <w:rFonts w:ascii="Times New Roman" w:hAnsi="Times New Roman" w:cs="Times New Roman"/>
-                <w:lang w:val="tr-TR"/>
-              </w:rPr>
-            </w:pPr>
-            <w:r>
-              <w:rPr>
-                <w:rFonts w:ascii="Times New Roman" w:hAnsi="Times New Roman" w:cs="Times New Roman"/>
-                <w:lang w:val="tr-TR"/>
-              </w:rPr>
-              <w:t xml:space="preserve">Shutter ID: 2819847141 (fotoğraf) — Single golden firework burst on black night sky</w:t>
-            </w:r>
-          </w:p>
-        </w:tc>
-      </w:tr>
-    </w:tbl>
-    <w:p>
-      <w:pPr>
-        <w:jc w:val="both"/>
-        <w:rPr>
-          <w:rFonts w:ascii="Times New Roman" w:hAnsi="Times New Roman" w:cs="Times New Roman"/>
-          <w:lang w:val="tr-TR"/>
-        </w:rPr>
-      </w:pPr>
+      </w:pPr>
+      <w:r>
+        <w:drawing>
+          <wp:inline xmlns:a="http://schemas.openxmlformats.org/drawingml/2006/main" xmlns:pic="http://schemas.openxmlformats.org/drawingml/2006/picture">
+            <wp:extent cx="3240000" cy="4320000"/>
+            <wp:docPr id="900014" name="Picture 900014"/>
+            <wp:cNvGraphicFramePr>
+              <a:graphicFrameLocks noChangeAspect="1"/>
+            </wp:cNvGraphicFramePr>
+            <a:graphic>
+              <a:graphicData uri="http://schemas.openxmlformats.org/drawingml/2006/picture">
+                <pic:pic>
+                  <pic:nvPicPr>
+                    <pic:cNvPr id="0" name="2819847141_d.jpg"/>
+                    <pic:cNvPicPr/>
+                  </pic:nvPicPr>
+                  <pic:blipFill>
+                    <a:blip r:embed="rId12"/>
+                    <a:stretch>
+                      <a:fillRect/>
+                    </a:stretch>
+                  </pic:blipFill>
+                  <pic:spPr>
+                    <a:xfrm>
+                      <a:off x="0" y="0"/>
+                      <a:ext cx="3240000" cy="4320000"/>
+                    </a:xfrm>
+                    <a:prstGeom prst="rect"/>
+                  </pic:spPr>
+                </pic:pic>
+              </a:graphicData>
+            </a:graphic>
+          </wp:inline>
+        </w:drawing>
+      </w:r>
+    </w:p>
+    <w:p>
+      <w:pPr>
+        <w:jc w:val="center"/>
+      </w:pPr>
+      <w:r>
+        <w:rPr>
+          <w:rFonts w:ascii="Times New Roman" w:hAnsi="Times New Roman" w:cs="Times New Roman"/>
+          <w:b/>
+          <w:bCs/>
+          <w:highlight w:val="yellow"/>
+          <w:lang w:val="tr-TR"/>
+        </w:rPr>
+        <w:t xml:space="preserve">Shutter id: 2819847141 (bölüm kapağı, tam sayfa)</w:t>
+      </w:r>
     </w:p>
     <w:p>
       <w:pPr>
@@ -1326,89 +1274,63 @@
         <w:t xml:space="preserve">Bazı araştırma gruplarının çalışmalarında, toprağa ekilmiş canlı bitkilerden elektrik akımı elde edilmiştir. Bitkiler fotosentezle ürettikleri organik maddelerin bir kısmını kökleri yoluyla toprağa bırakır. Kök çevresinde yaşayan bazı bakteriler bu maddeleri parçalarken elektron açığa çıkarır. Toprağa yerleştirilen elektrotlar bu elektronları bir dış devreye aktararak küçük bir elektrik akımı oluşturur. Bu yöntemle bitkilere zarar vermeden düşük güçte sensörlerin ve LED lambaların çalıştırılabileceği gösterilmiştir.</w:t>
       </w:r>
     </w:p>
-    <w:tbl>
-      <w:tblPr>
-        <w:tblW w:w="9000" w:type="dxa"/>
+    <w:p>
+      <w:pPr>
         <w:jc w:val="center"/>
-        <w:tblBorders>
-          <w:top w:val="single" w:sz="8" w:space="0" w:color="7F7F7F"/>
-          <w:left w:val="single" w:sz="8" w:space="0" w:color="7F7F7F"/>
-          <w:bottom w:val="single" w:sz="8" w:space="0" w:color="7F7F7F"/>
-          <w:right w:val="single" w:sz="8" w:space="0" w:color="7F7F7F"/>
-        </w:tblBorders>
-      </w:tblPr>
-      <w:tblGrid>
-        <w:gridCol w:w="9000"/>
-      </w:tblGrid>
-      <w:tr>
-        <w:tc>
-          <w:tcPr>
-            <w:tcW w:w="9000" w:type="dxa"/>
-            <w:shd w:val="clear" w:color="auto" w:fill="EDEDED"/>
-          </w:tcPr>
-          <w:p>
-            <w:pPr>
-              <w:jc w:val="both"/>
-              <w:rPr>
-                <w:rFonts w:ascii="Times New Roman" w:hAnsi="Times New Roman" w:cs="Times New Roman"/>
-                <w:lang w:val="tr-TR"/>
-              </w:rPr>
-            </w:pPr>
-            <w:r>
-              <w:rPr>
-                <w:rFonts w:ascii="Times New Roman" w:hAnsi="Times New Roman" w:cs="Times New Roman"/>
-                <w:lang w:val="tr-TR"/>
-              </w:rPr>
-              <w:t xml:space="preserve">GÖRSEL ALANI (Shutterstock)</w:t>
-            </w:r>
-          </w:p>
-          <w:p>
-            <w:pPr>
-              <w:jc w:val="both"/>
-              <w:rPr>
-                <w:rFonts w:ascii="Times New Roman" w:hAnsi="Times New Roman" w:cs="Times New Roman"/>
-                <w:lang w:val="tr-TR"/>
-              </w:rPr>
-            </w:pPr>
-            <w:r>
-              <w:rPr>
-                <w:rFonts w:ascii="Times New Roman" w:hAnsi="Times New Roman" w:cs="Times New Roman"/>
-                <w:lang w:val="tr-TR"/>
-              </w:rPr>
-              <w:t xml:space="preserve">Tarif: Saksıda büyüyen bir bitki; toprağa batırılmış iki elektrottan çıkan kabloların küçük bir LED lambaya bağlandığı düzenek (vektörel illüstrasyon olabilir).</w:t>
-            </w:r>
-          </w:p>
-          <w:p>
-            <w:pPr>
-              <w:jc w:val="both"/>
-              <w:rPr>
-                <w:rFonts w:ascii="Times New Roman" w:hAnsi="Times New Roman" w:cs="Times New Roman"/>
-                <w:lang w:val="tr-TR"/>
-              </w:rPr>
-            </w:pPr>
-            <w:r>
-              <w:rPr>
-                <w:rFonts w:ascii="Times New Roman" w:hAnsi="Times New Roman" w:cs="Times New Roman"/>
-                <w:lang w:val="tr-TR"/>
-              </w:rPr>
-              <w:t xml:space="preserve">Shutter ID: 2614014509 (fotoğraf) — Electric light bulb containing a green plant (concept)</w:t>
-            </w:r>
-          </w:p>
-        </w:tc>
-      </w:tr>
-    </w:tbl>
-    <w:p>
-      <w:pPr>
-        <w:jc w:val="both"/>
-        <w:rPr>
-          <w:rFonts w:ascii="Times New Roman" w:hAnsi="Times New Roman" w:cs="Times New Roman"/>
-          <w:lang w:val="tr-TR"/>
-        </w:rPr>
-      </w:pPr>
+      </w:pPr>
+      <w:r>
+        <w:drawing>
+          <wp:inline xmlns:a="http://schemas.openxmlformats.org/drawingml/2006/main" xmlns:pic="http://schemas.openxmlformats.org/drawingml/2006/picture">
+            <wp:extent cx="3436363" cy="2520000"/>
+            <wp:docPr id="900015" name="Picture 900015"/>
+            <wp:cNvGraphicFramePr>
+              <a:graphicFrameLocks noChangeAspect="1"/>
+            </wp:cNvGraphicFramePr>
+            <a:graphic>
+              <a:graphicData uri="http://schemas.openxmlformats.org/drawingml/2006/picture">
+                <pic:pic>
+                  <pic:nvPicPr>
+                    <pic:cNvPr id="0" name="2614014509_d.jpg"/>
+                    <pic:cNvPicPr/>
+                  </pic:nvPicPr>
+                  <pic:blipFill>
+                    <a:blip r:embed="rId13"/>
+                    <a:stretch>
+                      <a:fillRect/>
+                    </a:stretch>
+                  </pic:blipFill>
+                  <pic:spPr>
+                    <a:xfrm>
+                      <a:off x="0" y="0"/>
+                      <a:ext cx="3436363" cy="2520000"/>
+                    </a:xfrm>
+                    <a:prstGeom prst="rect"/>
+                  </pic:spPr>
+                </pic:pic>
+              </a:graphicData>
+            </a:graphic>
+          </wp:inline>
+        </w:drawing>
+      </w:r>
     </w:p>
     <w:p>
       <w:pPr>
         <w:jc w:val="center"/>
+      </w:pPr>
+      <w:r>
+        <w:rPr>
+          <w:rFonts w:ascii="Times New Roman" w:hAnsi="Times New Roman" w:cs="Times New Roman"/>
+          <w:b/>
+          <w:bCs/>
+          <w:highlight w:val="yellow"/>
+          <w:lang w:val="tr-TR"/>
+        </w:rPr>
+        <w:t xml:space="preserve">Shutter id: 2614014509</w:t>
+      </w:r>
+    </w:p>
+    <w:p>
+      <w:pPr>
+        <w:jc w:val="center"/>
         <w:rPr>
           <w:rFonts w:ascii="Times New Roman" w:hAnsi="Times New Roman" w:cs="Times New Roman"/>
           <w:lang w:val="tr-TR"/>
@@ -1438,85 +1360,59 @@
         <w:t xml:space="preserve">Benzer bir elektron alışverişini laboratuvarda da gözlemleyebilirsiniz. Mavi renkli bakır(II) sülfat çözeltisine temizlenmiş bir demir çivi daldırılıp bir süre beklendiğinde çivinin yüzeyi kızıl kahverengi bir tabakayla kaplanır, çözeltinin mavi rengi ise giderek açılır.</w:t>
       </w:r>
     </w:p>
-    <w:tbl>
-      <w:tblPr>
-        <w:tblW w:w="9000" w:type="dxa"/>
+    <w:p>
+      <w:pPr>
         <w:jc w:val="center"/>
-        <w:tblBorders>
-          <w:top w:val="single" w:sz="8" w:space="0" w:color="7F7F7F"/>
-          <w:left w:val="single" w:sz="8" w:space="0" w:color="7F7F7F"/>
-          <w:bottom w:val="single" w:sz="8" w:space="0" w:color="7F7F7F"/>
-          <w:right w:val="single" w:sz="8" w:space="0" w:color="7F7F7F"/>
-        </w:tblBorders>
-      </w:tblPr>
-      <w:tblGrid>
-        <w:gridCol w:w="9000"/>
-      </w:tblGrid>
-      <w:tr>
-        <w:tc>
-          <w:tcPr>
-            <w:tcW w:w="9000" w:type="dxa"/>
-            <w:shd w:val="clear" w:color="auto" w:fill="EDEDED"/>
-          </w:tcPr>
-          <w:p>
-            <w:pPr>
-              <w:jc w:val="both"/>
-              <w:rPr>
-                <w:rFonts w:ascii="Times New Roman" w:hAnsi="Times New Roman" w:cs="Times New Roman"/>
-                <w:lang w:val="tr-TR"/>
-              </w:rPr>
-            </w:pPr>
-            <w:r>
-              <w:rPr>
-                <w:rFonts w:ascii="Times New Roman" w:hAnsi="Times New Roman" w:cs="Times New Roman"/>
-                <w:lang w:val="tr-TR"/>
-              </w:rPr>
-              <w:t xml:space="preserve">GÖRSEL ALANI (Shutterstock)</w:t>
-            </w:r>
-          </w:p>
-          <w:p>
-            <w:pPr>
-              <w:jc w:val="both"/>
-              <w:rPr>
-                <w:rFonts w:ascii="Times New Roman" w:hAnsi="Times New Roman" w:cs="Times New Roman"/>
-                <w:lang w:val="tr-TR"/>
-              </w:rPr>
-            </w:pPr>
-            <w:r>
-              <w:rPr>
-                <w:rFonts w:ascii="Times New Roman" w:hAnsi="Times New Roman" w:cs="Times New Roman"/>
-                <w:lang w:val="tr-TR"/>
-              </w:rPr>
-              <w:t xml:space="preserve">Tarif: Mavi bakır(II) sülfat çözeltisi bulunan bir deney tüpü ve yanında yüzeyi kızıl kahverengi bakırla kaplanmış demir çivi; önce-sonra karşılaştırmalı fotoğraf.</w:t>
-            </w:r>
-          </w:p>
-          <w:p>
-            <w:pPr>
-              <w:jc w:val="both"/>
-              <w:rPr>
-                <w:rFonts w:ascii="Times New Roman" w:hAnsi="Times New Roman" w:cs="Times New Roman"/>
-                <w:lang w:val="tr-TR"/>
-              </w:rPr>
-            </w:pPr>
-            <w:r>
-              <w:rPr>
-                <w:rFonts w:ascii="Times New Roman" w:hAnsi="Times New Roman" w:cs="Times New Roman"/>
-                <w:lang w:val="tr-TR"/>
-              </w:rPr>
-              <w:t xml:space="preserve">Shutter ID: 2786394433 (fotoğraf) — Lab worker suspending an iron nail in copper sulfate solution with tweezers</w:t>
-            </w:r>
-          </w:p>
-        </w:tc>
-      </w:tr>
-    </w:tbl>
-    <w:p>
-      <w:pPr>
-        <w:jc w:val="both"/>
-        <w:rPr>
-          <w:rFonts w:ascii="Times New Roman" w:hAnsi="Times New Roman" w:cs="Times New Roman"/>
-          <w:lang w:val="tr-TR"/>
-        </w:rPr>
-      </w:pPr>
+      </w:pPr>
+      <w:r>
+        <w:drawing>
+          <wp:inline xmlns:a="http://schemas.openxmlformats.org/drawingml/2006/main" xmlns:pic="http://schemas.openxmlformats.org/drawingml/2006/picture">
+            <wp:extent cx="4004237" cy="2520000"/>
+            <wp:docPr id="900016" name="Picture 900016"/>
+            <wp:cNvGraphicFramePr>
+              <a:graphicFrameLocks noChangeAspect="1"/>
+            </wp:cNvGraphicFramePr>
+            <a:graphic>
+              <a:graphicData uri="http://schemas.openxmlformats.org/drawingml/2006/picture">
+                <pic:pic>
+                  <pic:nvPicPr>
+                    <pic:cNvPr id="0" name="2786394433_d.jpg"/>
+                    <pic:cNvPicPr/>
+                  </pic:nvPicPr>
+                  <pic:blipFill>
+                    <a:blip r:embed="rId14"/>
+                    <a:stretch>
+                      <a:fillRect/>
+                    </a:stretch>
+                  </pic:blipFill>
+                  <pic:spPr>
+                    <a:xfrm>
+                      <a:off x="0" y="0"/>
+                      <a:ext cx="4004237" cy="2520000"/>
+                    </a:xfrm>
+                    <a:prstGeom prst="rect"/>
+                  </pic:spPr>
+                </pic:pic>
+              </a:graphicData>
+            </a:graphic>
+          </wp:inline>
+        </w:drawing>
+      </w:r>
+    </w:p>
+    <w:p>
+      <w:pPr>
+        <w:jc w:val="center"/>
+      </w:pPr>
+      <w:r>
+        <w:rPr>
+          <w:rFonts w:ascii="Times New Roman" w:hAnsi="Times New Roman" w:cs="Times New Roman"/>
+          <w:b/>
+          <w:bCs/>
+          <w:highlight w:val="yellow"/>
+          <w:lang w:val="tr-TR"/>
+        </w:rPr>
+        <w:t xml:space="preserve">Shutter id: 2786394433</w:t>
+      </w:r>
     </w:p>
     <w:p>
       <w:pPr>
@@ -1893,99 +1789,73 @@
         <w:t xml:space="preserve">Bu sorunun cevabını bir etkinlik yaparak keşfediniz. Analiz ve Keşif Atölyesi 1.1.’de bilimsel gözlem yapacaksınız: Metallerin oksijen, seyreltik hidroklorik asit ve metal tuzu çözeltileriyle verdikleri tepkimelerde kimyasal değişimi gösteren nitelikleri belirleyecek, bu niteliklere ilişkin verileri toplayıp kaydedecek, ardından topladığınız verileri tanecik modelleri ve sembolik gösterimlerle açıklayacaksınız. Çalışmanızı adım adım planlamanız ve gözlemlerinizi araştırmacı bir tutumla kayda geçirmeniz çalışkanlık değerinizi destekleyecek; etkinlik sonunda kendi öğrenme sürecinizi değerlendirirken kendinizi tanıma ve düzenleme becerilerinizi kullanacaksınız.</w:t>
       </w:r>
     </w:p>
-    <w:tbl>
-      <w:tblPr>
-        <w:tblW w:w="9000" w:type="dxa"/>
+    <w:p>
+      <w:pPr>
         <w:jc w:val="center"/>
-        <w:tblBorders>
-          <w:top w:val="single" w:sz="8" w:space="0" w:color="7F7F7F"/>
-          <w:left w:val="single" w:sz="8" w:space="0" w:color="7F7F7F"/>
-          <w:bottom w:val="single" w:sz="8" w:space="0" w:color="7F7F7F"/>
-          <w:right w:val="single" w:sz="8" w:space="0" w:color="7F7F7F"/>
-        </w:tblBorders>
-      </w:tblPr>
-      <w:tblGrid>
-        <w:gridCol w:w="9000"/>
-      </w:tblGrid>
-      <w:tr>
-        <w:tc>
-          <w:tcPr>
-            <w:tcW w:w="9000" w:type="dxa"/>
-            <w:shd w:val="clear" w:color="auto" w:fill="EDEDED"/>
-          </w:tcPr>
-          <w:p>
-            <w:pPr>
-              <w:jc w:val="both"/>
-              <w:rPr>
-                <w:rFonts w:ascii="Times New Roman" w:hAnsi="Times New Roman" w:cs="Times New Roman"/>
-                <w:lang w:val="tr-TR"/>
-              </w:rPr>
-            </w:pPr>
-            <w:r>
-              <w:rPr>
-                <w:rFonts w:ascii="Times New Roman" w:hAnsi="Times New Roman" w:cs="Times New Roman"/>
-                <w:lang w:val="tr-TR"/>
-              </w:rPr>
-              <w:t xml:space="preserve">GÖRSEL ALANI (Shutterstock)</w:t>
-            </w:r>
-          </w:p>
-          <w:p>
-            <w:pPr>
-              <w:jc w:val="both"/>
-              <w:rPr>
-                <w:rFonts w:ascii="Times New Roman" w:hAnsi="Times New Roman" w:cs="Times New Roman"/>
-                <w:lang w:val="tr-TR"/>
-              </w:rPr>
-            </w:pPr>
-            <w:r>
-              <w:rPr>
-                <w:rFonts w:ascii="Times New Roman" w:hAnsi="Times New Roman" w:cs="Times New Roman"/>
-                <w:lang w:val="tr-TR"/>
-              </w:rPr>
-              <w:t xml:space="preserve">Tarif: Bakırcılar çarşısında bir dükkânda raflara dizilmiş parlak, dövme bakır kaplar; yanında eskimiş, kararmış bir bakır tencere.</w:t>
-            </w:r>
-          </w:p>
-          <w:p>
-            <w:pPr>
-              <w:jc w:val="both"/>
-              <w:rPr>
-                <w:rFonts w:ascii="Times New Roman" w:hAnsi="Times New Roman" w:cs="Times New Roman"/>
-                <w:lang w:val="tr-TR"/>
-              </w:rPr>
-            </w:pPr>
-            <w:r>
-              <w:rPr>
-                <w:rFonts w:ascii="Times New Roman" w:hAnsi="Times New Roman" w:cs="Times New Roman"/>
-                <w:lang w:val="tr-TR"/>
-              </w:rPr>
-              <w:t xml:space="preserve">Shutter ID: 2664011831 (fotoğraf) — Copper coffee pots with traditional Turkish decoration</w:t>
-            </w:r>
-          </w:p>
-        </w:tc>
-      </w:tr>
-    </w:tbl>
-    <w:p>
-      <w:pPr>
-        <w:jc w:val="both"/>
-        <w:rPr>
-          <w:rFonts w:ascii="Times New Roman" w:hAnsi="Times New Roman" w:cs="Times New Roman"/>
-          <w:lang w:val="tr-TR"/>
-        </w:rPr>
-      </w:pPr>
+      </w:pPr>
+      <w:r>
+        <w:drawing>
+          <wp:inline xmlns:a="http://schemas.openxmlformats.org/drawingml/2006/main" xmlns:pic="http://schemas.openxmlformats.org/drawingml/2006/picture">
+            <wp:extent cx="3436363" cy="2520000"/>
+            <wp:docPr id="900017" name="Picture 900017"/>
+            <wp:cNvGraphicFramePr>
+              <a:graphicFrameLocks noChangeAspect="1"/>
+            </wp:cNvGraphicFramePr>
+            <a:graphic>
+              <a:graphicData uri="http://schemas.openxmlformats.org/drawingml/2006/picture">
+                <pic:pic>
+                  <pic:nvPicPr>
+                    <pic:cNvPr id="0" name="2664011831_d.jpg"/>
+                    <pic:cNvPicPr/>
+                  </pic:nvPicPr>
+                  <pic:blipFill>
+                    <a:blip r:embed="rId15"/>
+                    <a:stretch>
+                      <a:fillRect/>
+                    </a:stretch>
+                  </pic:blipFill>
+                  <pic:spPr>
+                    <a:xfrm>
+                      <a:off x="0" y="0"/>
+                      <a:ext cx="3436363" cy="2520000"/>
+                    </a:xfrm>
+                    <a:prstGeom prst="rect"/>
+                  </pic:spPr>
+                </pic:pic>
+              </a:graphicData>
+            </a:graphic>
+          </wp:inline>
+        </w:drawing>
+      </w:r>
     </w:p>
     <w:p>
       <w:pPr>
         <w:jc w:val="center"/>
-        <w:rPr>
-          <w:rFonts w:ascii="Times New Roman" w:hAnsi="Times New Roman" w:cs="Times New Roman"/>
-          <w:lang w:val="tr-TR"/>
-        </w:rPr>
       </w:pPr>
       <w:r>
         <w:rPr>
           <w:rFonts w:ascii="Times New Roman" w:hAnsi="Times New Roman" w:cs="Times New Roman"/>
           <w:b/>
           <w:bCs/>
+          <w:highlight w:val="yellow"/>
+          <w:lang w:val="tr-TR"/>
+        </w:rPr>
+        <w:t xml:space="preserve">Shutter id: 2664011831</w:t>
+      </w:r>
+    </w:p>
+    <w:p>
+      <w:pPr>
+        <w:jc w:val="center"/>
+        <w:rPr>
+          <w:rFonts w:ascii="Times New Roman" w:hAnsi="Times New Roman" w:cs="Times New Roman"/>
+          <w:lang w:val="tr-TR"/>
+        </w:rPr>
+      </w:pPr>
+      <w:r>
+        <w:rPr>
+          <w:rFonts w:ascii="Times New Roman" w:hAnsi="Times New Roman" w:cs="Times New Roman"/>
+          <w:b/>
+          <w:bCs/>
           <w:lang w:val="tr-TR"/>
         </w:rPr>
         <w:t xml:space="preserve">Görsel A:</w:t>
@@ -1998,85 +1868,59 @@
         <w:t xml:space="preserve"> Bakırcılar çarşısında dövülen bakır kaplar</w:t>
       </w:r>
     </w:p>
-    <w:tbl>
-      <w:tblPr>
-        <w:tblW w:w="9000" w:type="dxa"/>
+    <w:p>
+      <w:pPr>
         <w:jc w:val="center"/>
-        <w:tblBorders>
-          <w:top w:val="single" w:sz="8" w:space="0" w:color="7F7F7F"/>
-          <w:left w:val="single" w:sz="8" w:space="0" w:color="7F7F7F"/>
-          <w:bottom w:val="single" w:sz="8" w:space="0" w:color="7F7F7F"/>
-          <w:right w:val="single" w:sz="8" w:space="0" w:color="7F7F7F"/>
-        </w:tblBorders>
-      </w:tblPr>
-      <w:tblGrid>
-        <w:gridCol w:w="9000"/>
-      </w:tblGrid>
-      <w:tr>
-        <w:tc>
-          <w:tcPr>
-            <w:tcW w:w="9000" w:type="dxa"/>
-            <w:shd w:val="clear" w:color="auto" w:fill="EDEDED"/>
-          </w:tcPr>
-          <w:p>
-            <w:pPr>
-              <w:jc w:val="both"/>
-              <w:rPr>
-                <w:rFonts w:ascii="Times New Roman" w:hAnsi="Times New Roman" w:cs="Times New Roman"/>
-                <w:lang w:val="tr-TR"/>
-              </w:rPr>
-            </w:pPr>
-            <w:r>
-              <w:rPr>
-                <w:rFonts w:ascii="Times New Roman" w:hAnsi="Times New Roman" w:cs="Times New Roman"/>
-                <w:lang w:val="tr-TR"/>
-              </w:rPr>
-              <w:t xml:space="preserve">GÖRSEL ALANI (Shutterstock)</w:t>
-            </w:r>
-          </w:p>
-          <w:p>
-            <w:pPr>
-              <w:jc w:val="both"/>
-              <w:rPr>
-                <w:rFonts w:ascii="Times New Roman" w:hAnsi="Times New Roman" w:cs="Times New Roman"/>
-                <w:lang w:val="tr-TR"/>
-              </w:rPr>
-            </w:pPr>
-            <w:r>
-              <w:rPr>
-                <w:rFonts w:ascii="Times New Roman" w:hAnsi="Times New Roman" w:cs="Times New Roman"/>
-                <w:lang w:val="tr-TR"/>
-              </w:rPr>
-              <w:t xml:space="preserve">Tarif: Maşa ile tutulan magnezyum şeridin göz kamaştırıcı beyaz ışıkla yanması; altta beyaz magnezyum oksit tozu (laboratuvar ortamı).</w:t>
-            </w:r>
-          </w:p>
-          <w:p>
-            <w:pPr>
-              <w:jc w:val="both"/>
-              <w:rPr>
-                <w:rFonts w:ascii="Times New Roman" w:hAnsi="Times New Roman" w:cs="Times New Roman"/>
-                <w:lang w:val="tr-TR"/>
-              </w:rPr>
-            </w:pPr>
-            <w:r>
-              <w:rPr>
-                <w:rFonts w:ascii="Times New Roman" w:hAnsi="Times New Roman" w:cs="Times New Roman"/>
-                <w:lang w:val="tr-TR"/>
-              </w:rPr>
-              <w:t xml:space="preserve">Shutter ID: 1301157493 (fotoğraf) — Magnesium burns with bright white flame</w:t>
-            </w:r>
-          </w:p>
-        </w:tc>
-      </w:tr>
-    </w:tbl>
-    <w:p>
-      <w:pPr>
-        <w:jc w:val="both"/>
-        <w:rPr>
-          <w:rFonts w:ascii="Times New Roman" w:hAnsi="Times New Roman" w:cs="Times New Roman"/>
-          <w:lang w:val="tr-TR"/>
-        </w:rPr>
-      </w:pPr>
+      </w:pPr>
+      <w:r>
+        <w:drawing>
+          <wp:inline xmlns:a="http://schemas.openxmlformats.org/drawingml/2006/main" xmlns:pic="http://schemas.openxmlformats.org/drawingml/2006/picture">
+            <wp:extent cx="1576574" cy="2519998"/>
+            <wp:docPr id="900018" name="Picture 900018"/>
+            <wp:cNvGraphicFramePr>
+              <a:graphicFrameLocks noChangeAspect="1"/>
+            </wp:cNvGraphicFramePr>
+            <a:graphic>
+              <a:graphicData uri="http://schemas.openxmlformats.org/drawingml/2006/picture">
+                <pic:pic>
+                  <pic:nvPicPr>
+                    <pic:cNvPr id="0" name="1301157493_d.jpg"/>
+                    <pic:cNvPicPr/>
+                  </pic:nvPicPr>
+                  <pic:blipFill>
+                    <a:blip r:embed="rId16"/>
+                    <a:stretch>
+                      <a:fillRect/>
+                    </a:stretch>
+                  </pic:blipFill>
+                  <pic:spPr>
+                    <a:xfrm>
+                      <a:off x="0" y="0"/>
+                      <a:ext cx="1576574" cy="2519998"/>
+                    </a:xfrm>
+                    <a:prstGeom prst="rect"/>
+                  </pic:spPr>
+                </pic:pic>
+              </a:graphicData>
+            </a:graphic>
+          </wp:inline>
+        </w:drawing>
+      </w:r>
+    </w:p>
+    <w:p>
+      <w:pPr>
+        <w:jc w:val="center"/>
+      </w:pPr>
+      <w:r>
+        <w:rPr>
+          <w:rFonts w:ascii="Times New Roman" w:hAnsi="Times New Roman" w:cs="Times New Roman"/>
+          <w:b/>
+          <w:bCs/>
+          <w:highlight w:val="yellow"/>
+          <w:lang w:val="tr-TR"/>
+        </w:rPr>
+        <w:t xml:space="preserve">Shutter id: 1301157493</w:t>
+      </w:r>
     </w:p>
     <w:p>
       <w:pPr>
@@ -5683,85 +5527,59 @@
         <w:t xml:space="preserve">Günlük hayatta karşılaşılan pek çok değişim de redoks tepkimesidir. Örneğin nemli havada bekleyen demir eşyaların paslanmasında demir atomları elektron vererek yükseltgenir, havadaki oksijen ise indirgenir (Görsel D). Pillerin elektrik üretmesi, metallerin cevherlerinden elde edilmesi, yakıtların yanması ve canlılarda besinlerden enerji elde edilmesi de redoks tepkimelerine dayanır.</w:t>
       </w:r>
     </w:p>
-    <w:tbl>
-      <w:tblPr>
-        <w:tblW w:w="9000" w:type="dxa"/>
+    <w:p>
+      <w:pPr>
         <w:jc w:val="center"/>
-        <w:tblBorders>
-          <w:top w:val="single" w:sz="8" w:space="0" w:color="7F7F7F"/>
-          <w:left w:val="single" w:sz="8" w:space="0" w:color="7F7F7F"/>
-          <w:bottom w:val="single" w:sz="8" w:space="0" w:color="7F7F7F"/>
-          <w:right w:val="single" w:sz="8" w:space="0" w:color="7F7F7F"/>
-        </w:tblBorders>
-      </w:tblPr>
-      <w:tblGrid>
-        <w:gridCol w:w="9000"/>
-      </w:tblGrid>
-      <w:tr>
-        <w:tc>
-          <w:tcPr>
-            <w:tcW w:w="9000" w:type="dxa"/>
-            <w:shd w:val="clear" w:color="auto" w:fill="EDEDED"/>
-          </w:tcPr>
-          <w:p>
-            <w:pPr>
-              <w:jc w:val="both"/>
-              <w:rPr>
-                <w:rFonts w:ascii="Times New Roman" w:hAnsi="Times New Roman" w:cs="Times New Roman"/>
-                <w:lang w:val="tr-TR"/>
-              </w:rPr>
-            </w:pPr>
-            <w:r>
-              <w:rPr>
-                <w:rFonts w:ascii="Times New Roman" w:hAnsi="Times New Roman" w:cs="Times New Roman"/>
-                <w:lang w:val="tr-TR"/>
-              </w:rPr>
-              <w:t xml:space="preserve">GÖRSEL ALANI (Shutterstock)</w:t>
-            </w:r>
-          </w:p>
-          <w:p>
-            <w:pPr>
-              <w:jc w:val="both"/>
-              <w:rPr>
-                <w:rFonts w:ascii="Times New Roman" w:hAnsi="Times New Roman" w:cs="Times New Roman"/>
-                <w:lang w:val="tr-TR"/>
-              </w:rPr>
-            </w:pPr>
-            <w:r>
-              <w:rPr>
-                <w:rFonts w:ascii="Times New Roman" w:hAnsi="Times New Roman" w:cs="Times New Roman"/>
-                <w:lang w:val="tr-TR"/>
-              </w:rPr>
-              <w:t xml:space="preserve">Tarif: Nemli bir ortamda paslanmış eski demir zincir, kilit ve civatalar; yüzeylerinde kızıl kahverengi pas tabakası.</w:t>
-            </w:r>
-          </w:p>
-          <w:p>
-            <w:pPr>
-              <w:jc w:val="both"/>
-              <w:rPr>
-                <w:rFonts w:ascii="Times New Roman" w:hAnsi="Times New Roman" w:cs="Times New Roman"/>
-                <w:lang w:val="tr-TR"/>
-              </w:rPr>
-            </w:pPr>
-            <w:r>
-              <w:rPr>
-                <w:rFonts w:ascii="Times New Roman" w:hAnsi="Times New Roman" w:cs="Times New Roman"/>
-                <w:lang w:val="tr-TR"/>
-              </w:rPr>
-              <w:t xml:space="preserve">Shutter ID: 2837328711 (fotoğraf) — A rusty padlock and rusty metal chain</w:t>
-            </w:r>
-          </w:p>
-        </w:tc>
-      </w:tr>
-    </w:tbl>
-    <w:p>
-      <w:pPr>
-        <w:jc w:val="both"/>
-        <w:rPr>
-          <w:rFonts w:ascii="Times New Roman" w:hAnsi="Times New Roman" w:cs="Times New Roman"/>
-          <w:lang w:val="tr-TR"/>
-        </w:rPr>
-      </w:pPr>
+      </w:pPr>
+      <w:r>
+        <w:drawing>
+          <wp:inline xmlns:a="http://schemas.openxmlformats.org/drawingml/2006/main" xmlns:pic="http://schemas.openxmlformats.org/drawingml/2006/picture">
+            <wp:extent cx="1578150" cy="2520000"/>
+            <wp:docPr id="900019" name="Picture 900019"/>
+            <wp:cNvGraphicFramePr>
+              <a:graphicFrameLocks noChangeAspect="1"/>
+            </wp:cNvGraphicFramePr>
+            <a:graphic>
+              <a:graphicData uri="http://schemas.openxmlformats.org/drawingml/2006/picture">
+                <pic:pic>
+                  <pic:nvPicPr>
+                    <pic:cNvPr id="0" name="2837328711_d.jpg"/>
+                    <pic:cNvPicPr/>
+                  </pic:nvPicPr>
+                  <pic:blipFill>
+                    <a:blip r:embed="rId17"/>
+                    <a:stretch>
+                      <a:fillRect/>
+                    </a:stretch>
+                  </pic:blipFill>
+                  <pic:spPr>
+                    <a:xfrm>
+                      <a:off x="0" y="0"/>
+                      <a:ext cx="1578150" cy="2520000"/>
+                    </a:xfrm>
+                    <a:prstGeom prst="rect"/>
+                  </pic:spPr>
+                </pic:pic>
+              </a:graphicData>
+            </a:graphic>
+          </wp:inline>
+        </w:drawing>
+      </w:r>
+    </w:p>
+    <w:p>
+      <w:pPr>
+        <w:jc w:val="center"/>
+      </w:pPr>
+      <w:r>
+        <w:rPr>
+          <w:rFonts w:ascii="Times New Roman" w:hAnsi="Times New Roman" w:cs="Times New Roman"/>
+          <w:b/>
+          <w:bCs/>
+          <w:highlight w:val="yellow"/>
+          <w:lang w:val="tr-TR"/>
+        </w:rPr>
+        <w:t xml:space="preserve">Shutter id: 2837328711</w:t>
+      </w:r>
     </w:p>
     <w:p>
       <w:pPr>
@@ -6789,85 +6607,59 @@
         <w:t xml:space="preserve">Tepkimede açığa çıkan ısı o kadar fazladır ki oluşan demir sıvı hâlde elde edilir. Rayların arasındaki kalıba akıtılan erimiş demir soğuyarak iki rayı birbirine kaynatır. Bu yöntem, büyük kaynak makinelerinin taşınamadığı yerlerde de uygulanabildiği için tercih edilir.</w:t>
       </w:r>
     </w:p>
-    <w:tbl>
-      <w:tblPr>
-        <w:tblW w:w="9000" w:type="dxa"/>
+    <w:p>
+      <w:pPr>
         <w:jc w:val="center"/>
-        <w:tblBorders>
-          <w:top w:val="single" w:sz="8" w:space="0" w:color="7F7F7F"/>
-          <w:left w:val="single" w:sz="8" w:space="0" w:color="7F7F7F"/>
-          <w:bottom w:val="single" w:sz="8" w:space="0" w:color="7F7F7F"/>
-          <w:right w:val="single" w:sz="8" w:space="0" w:color="7F7F7F"/>
-        </w:tblBorders>
-      </w:tblPr>
-      <w:tblGrid>
-        <w:gridCol w:w="9000"/>
-      </w:tblGrid>
-      <w:tr>
-        <w:tc>
-          <w:tcPr>
-            <w:tcW w:w="9000" w:type="dxa"/>
-            <w:shd w:val="clear" w:color="auto" w:fill="EDEDED"/>
-          </w:tcPr>
-          <w:p>
-            <w:pPr>
-              <w:jc w:val="both"/>
-              <w:rPr>
-                <w:rFonts w:ascii="Times New Roman" w:hAnsi="Times New Roman" w:cs="Times New Roman"/>
-                <w:lang w:val="tr-TR"/>
-              </w:rPr>
-            </w:pPr>
-            <w:r>
-              <w:rPr>
-                <w:rFonts w:ascii="Times New Roman" w:hAnsi="Times New Roman" w:cs="Times New Roman"/>
-                <w:lang w:val="tr-TR"/>
-              </w:rPr>
-              <w:t xml:space="preserve">GÖRSEL ALANI (Shutterstock)</w:t>
-            </w:r>
-          </w:p>
-          <w:p>
-            <w:pPr>
-              <w:jc w:val="both"/>
-              <w:rPr>
-                <w:rFonts w:ascii="Times New Roman" w:hAnsi="Times New Roman" w:cs="Times New Roman"/>
-                <w:lang w:val="tr-TR"/>
-              </w:rPr>
-            </w:pPr>
-            <w:r>
-              <w:rPr>
-                <w:rFonts w:ascii="Times New Roman" w:hAnsi="Times New Roman" w:cs="Times New Roman"/>
-                <w:lang w:val="tr-TR"/>
-              </w:rPr>
-              <w:t xml:space="preserve">Tarif: Demir yolu raylarının termit yöntemiyle kaynaklanması sırasında kalıptan taşan parlak kıvılcımlar; koruyucu ekipmanlı işçiler (yüzler seçilmesin).</w:t>
-            </w:r>
-          </w:p>
-          <w:p>
-            <w:pPr>
-              <w:jc w:val="both"/>
-              <w:rPr>
-                <w:rFonts w:ascii="Times New Roman" w:hAnsi="Times New Roman" w:cs="Times New Roman"/>
-                <w:lang w:val="tr-TR"/>
-              </w:rPr>
-            </w:pPr>
-            <w:r>
-              <w:rPr>
-                <w:rFonts w:ascii="Times New Roman" w:hAnsi="Times New Roman" w:cs="Times New Roman"/>
-                <w:lang w:val="tr-TR"/>
-              </w:rPr>
-              <w:t xml:space="preserve">Shutter ID: 2711259847 (fotoğraf) — Thermite welding on a railway track</w:t>
-            </w:r>
-          </w:p>
-        </w:tc>
-      </w:tr>
-    </w:tbl>
-    <w:p>
-      <w:pPr>
-        <w:jc w:val="both"/>
-        <w:rPr>
-          <w:rFonts w:ascii="Times New Roman" w:hAnsi="Times New Roman" w:cs="Times New Roman"/>
-          <w:lang w:val="tr-TR"/>
-        </w:rPr>
-      </w:pPr>
+      </w:pPr>
+      <w:r>
+        <w:drawing>
+          <wp:inline xmlns:a="http://schemas.openxmlformats.org/drawingml/2006/main" xmlns:pic="http://schemas.openxmlformats.org/drawingml/2006/picture">
+            <wp:extent cx="1575000" cy="2520000"/>
+            <wp:docPr id="900020" name="Picture 900020"/>
+            <wp:cNvGraphicFramePr>
+              <a:graphicFrameLocks noChangeAspect="1"/>
+            </wp:cNvGraphicFramePr>
+            <a:graphic>
+              <a:graphicData uri="http://schemas.openxmlformats.org/drawingml/2006/picture">
+                <pic:pic>
+                  <pic:nvPicPr>
+                    <pic:cNvPr id="0" name="2711259847_d.jpg"/>
+                    <pic:cNvPicPr/>
+                  </pic:nvPicPr>
+                  <pic:blipFill>
+                    <a:blip r:embed="rId18"/>
+                    <a:stretch>
+                      <a:fillRect/>
+                    </a:stretch>
+                  </pic:blipFill>
+                  <pic:spPr>
+                    <a:xfrm>
+                      <a:off x="0" y="0"/>
+                      <a:ext cx="1575000" cy="2520000"/>
+                    </a:xfrm>
+                    <a:prstGeom prst="rect"/>
+                  </pic:spPr>
+                </pic:pic>
+              </a:graphicData>
+            </a:graphic>
+          </wp:inline>
+        </w:drawing>
+      </w:r>
+    </w:p>
+    <w:p>
+      <w:pPr>
+        <w:jc w:val="center"/>
+      </w:pPr>
+      <w:r>
+        <w:rPr>
+          <w:rFonts w:ascii="Times New Roman" w:hAnsi="Times New Roman" w:cs="Times New Roman"/>
+          <w:b/>
+          <w:bCs/>
+          <w:highlight w:val="yellow"/>
+          <w:lang w:val="tr-TR"/>
+        </w:rPr>
+        <w:t xml:space="preserve">Shutter id: 2711259847</w:t>
+      </w:r>
     </w:p>
     <w:p>
       <w:pPr>

</xml_diff>

<commit_message>
Alt alta duran 15 fotograf cifti yan yana iki sutunlu duzene alindi (cift gorsel kurali)
</commit_message>
<xml_diff>
--- a/Kim12-1-1-Redoks-Tepkimeleri.docx
+++ b/Kim12-1-1-Redoks-Tepkimeleri.docx
@@ -1789,164 +1789,195 @@
         <w:t xml:space="preserve">Bu sorunun cevabını bir etkinlik yaparak keşfediniz. Analiz ve Keşif Atölyesi 1.1.’de bilimsel gözlem yapacaksınız: Metallerin oksijen, seyreltik hidroklorik asit ve metal tuzu çözeltileriyle verdikleri tepkimelerde kimyasal değişimi gösteren nitelikleri belirleyecek, bu niteliklere ilişkin verileri toplayıp kaydedecek, ardından topladığınız verileri tanecik modelleri ve sembolik gösterimlerle açıklayacaksınız. Çalışmanızı adım adım planlamanız ve gözlemlerinizi araştırmacı bir tutumla kayda geçirmeniz çalışkanlık değerinizi destekleyecek; etkinlik sonunda kendi öğrenme sürecinizi değerlendirirken kendinizi tanıma ve düzenleme becerilerinizi kullanacaksınız.</w:t>
       </w:r>
     </w:p>
-    <w:p>
-      <w:pPr>
+    <w:tbl>
+      <w:tblPr>
+        <w:tblW w:w="9000" w:type="dxa"/>
         <w:jc w:val="center"/>
-      </w:pPr>
-      <w:r>
-        <w:drawing>
-          <wp:inline xmlns:a="http://schemas.openxmlformats.org/drawingml/2006/main" xmlns:pic="http://schemas.openxmlformats.org/drawingml/2006/picture">
-            <wp:extent cx="3436363" cy="2520000"/>
-            <wp:docPr id="900017" name="Picture 900017"/>
-            <wp:cNvGraphicFramePr>
-              <a:graphicFrameLocks noChangeAspect="1"/>
-            </wp:cNvGraphicFramePr>
-            <a:graphic>
-              <a:graphicData uri="http://schemas.openxmlformats.org/drawingml/2006/picture">
-                <pic:pic>
-                  <pic:nvPicPr>
-                    <pic:cNvPr id="0" name="2664011831_d.jpg"/>
-                    <pic:cNvPicPr/>
-                  </pic:nvPicPr>
-                  <pic:blipFill>
-                    <a:blip r:embed="rId15"/>
-                    <a:stretch>
-                      <a:fillRect/>
-                    </a:stretch>
-                  </pic:blipFill>
-                  <pic:spPr>
-                    <a:xfrm>
-                      <a:off x="0" y="0"/>
-                      <a:ext cx="3436363" cy="2520000"/>
-                    </a:xfrm>
-                    <a:prstGeom prst="rect"/>
-                  </pic:spPr>
-                </pic:pic>
-              </a:graphicData>
-            </a:graphic>
-          </wp:inline>
-        </w:drawing>
-      </w:r>
-    </w:p>
-    <w:p>
-      <w:pPr>
-        <w:jc w:val="center"/>
-      </w:pPr>
-      <w:r>
-        <w:rPr>
-          <w:rFonts w:ascii="Times New Roman" w:hAnsi="Times New Roman" w:cs="Times New Roman"/>
-          <w:b/>
-          <w:bCs/>
-          <w:highlight w:val="yellow"/>
-          <w:lang w:val="tr-TR"/>
-        </w:rPr>
-        <w:t xml:space="preserve">Shutter id: 2664011831</w:t>
-      </w:r>
-    </w:p>
-    <w:p>
-      <w:pPr>
-        <w:jc w:val="center"/>
-        <w:rPr>
-          <w:rFonts w:ascii="Times New Roman" w:hAnsi="Times New Roman" w:cs="Times New Roman"/>
-          <w:lang w:val="tr-TR"/>
-        </w:rPr>
-      </w:pPr>
-      <w:r>
-        <w:rPr>
-          <w:rFonts w:ascii="Times New Roman" w:hAnsi="Times New Roman" w:cs="Times New Roman"/>
-          <w:b/>
-          <w:bCs/>
-          <w:lang w:val="tr-TR"/>
-        </w:rPr>
-        <w:t xml:space="preserve">Görsel A:</w:t>
-      </w:r>
-      <w:r>
-        <w:rPr>
-          <w:rFonts w:ascii="Times New Roman" w:hAnsi="Times New Roman" w:cs="Times New Roman"/>
-          <w:lang w:val="tr-TR"/>
-        </w:rPr>
-        <w:t xml:space="preserve"> Bakırcılar çarşısında dövülen bakır kaplar</w:t>
-      </w:r>
-    </w:p>
-    <w:p>
-      <w:pPr>
-        <w:jc w:val="center"/>
-      </w:pPr>
-      <w:r>
-        <w:drawing>
-          <wp:inline xmlns:a="http://schemas.openxmlformats.org/drawingml/2006/main" xmlns:pic="http://schemas.openxmlformats.org/drawingml/2006/picture">
-            <wp:extent cx="1576574" cy="2519998"/>
-            <wp:docPr id="900018" name="Picture 900018"/>
-            <wp:cNvGraphicFramePr>
-              <a:graphicFrameLocks noChangeAspect="1"/>
-            </wp:cNvGraphicFramePr>
-            <a:graphic>
-              <a:graphicData uri="http://schemas.openxmlformats.org/drawingml/2006/picture">
-                <pic:pic>
-                  <pic:nvPicPr>
-                    <pic:cNvPr id="0" name="1301157493_d.jpg"/>
-                    <pic:cNvPicPr/>
-                  </pic:nvPicPr>
-                  <pic:blipFill>
-                    <a:blip r:embed="rId16"/>
-                    <a:stretch>
-                      <a:fillRect/>
-                    </a:stretch>
-                  </pic:blipFill>
-                  <pic:spPr>
-                    <a:xfrm>
-                      <a:off x="0" y="0"/>
-                      <a:ext cx="1576574" cy="2519998"/>
-                    </a:xfrm>
-                    <a:prstGeom prst="rect"/>
-                  </pic:spPr>
-                </pic:pic>
-              </a:graphicData>
-            </a:graphic>
-          </wp:inline>
-        </w:drawing>
-      </w:r>
-    </w:p>
-    <w:p>
-      <w:pPr>
-        <w:jc w:val="center"/>
-      </w:pPr>
-      <w:r>
-        <w:rPr>
-          <w:rFonts w:ascii="Times New Roman" w:hAnsi="Times New Roman" w:cs="Times New Roman"/>
-          <w:b/>
-          <w:bCs/>
-          <w:highlight w:val="yellow"/>
-          <w:lang w:val="tr-TR"/>
-        </w:rPr>
-        <w:t xml:space="preserve">Shutter id: 1301157493</w:t>
-      </w:r>
-    </w:p>
-    <w:p>
-      <w:pPr>
-        <w:jc w:val="center"/>
-        <w:rPr>
-          <w:rFonts w:ascii="Times New Roman" w:hAnsi="Times New Roman" w:cs="Times New Roman"/>
-          <w:lang w:val="tr-TR"/>
-        </w:rPr>
-      </w:pPr>
-      <w:r>
-        <w:rPr>
-          <w:rFonts w:ascii="Times New Roman" w:hAnsi="Times New Roman" w:cs="Times New Roman"/>
-          <w:b/>
-          <w:bCs/>
-          <w:lang w:val="tr-TR"/>
-        </w:rPr>
-        <w:t xml:space="preserve">Görsel B:</w:t>
-      </w:r>
-      <w:r>
-        <w:rPr>
-          <w:rFonts w:ascii="Times New Roman" w:hAnsi="Times New Roman" w:cs="Times New Roman"/>
-          <w:lang w:val="tr-TR"/>
-        </w:rPr>
-        <w:t xml:space="preserve"> Magnezyum şeridin yanması</w:t>
-      </w:r>
-    </w:p>
+        <w:tblBorders>
+          <w:top w:val="nil"/>
+          <w:left w:val="nil"/>
+          <w:bottom w:val="nil"/>
+          <w:right w:val="nil"/>
+          <w:insideH w:val="nil"/>
+          <w:insideV w:val="nil"/>
+        </w:tblBorders>
+        <w:tblLayout w:type="fixed"/>
+      </w:tblPr>
+      <w:tblGrid>
+        <w:gridCol w:w="4500"/>
+        <w:gridCol w:w="4500"/>
+      </w:tblGrid>
+      <w:tr>
+        <w:tc>
+          <w:tcPr>
+            <w:tcW w:w="4500" w:type="dxa"/>
+          </w:tcPr>
+          <w:p>
+            <w:pPr>
+              <w:jc w:val="center"/>
+            </w:pPr>
+            <w:r>
+              <w:drawing>
+                <wp:inline xmlns:a="http://schemas.openxmlformats.org/drawingml/2006/main" xmlns:pic="http://schemas.openxmlformats.org/drawingml/2006/picture">
+                  <wp:extent cx="2628000" cy="1927200"/>
+                  <wp:docPr id="900017" name="Picture 900017"/>
+                  <wp:cNvGraphicFramePr>
+                    <a:graphicFrameLocks noChangeAspect="1"/>
+                  </wp:cNvGraphicFramePr>
+                  <a:graphic>
+                    <a:graphicData uri="http://schemas.openxmlformats.org/drawingml/2006/picture">
+                      <pic:pic>
+                        <pic:nvPicPr>
+                          <pic:cNvPr id="0" name="2664011831_d.jpg"/>
+                          <pic:cNvPicPr/>
+                        </pic:nvPicPr>
+                        <pic:blipFill>
+                          <a:blip r:embed="rId15"/>
+                          <a:stretch>
+                            <a:fillRect/>
+                          </a:stretch>
+                        </pic:blipFill>
+                        <pic:spPr>
+                          <a:xfrm>
+                            <a:off x="0" y="0"/>
+                            <a:ext cx="2628000" cy="1927200"/>
+                          </a:xfrm>
+                          <a:prstGeom prst="rect"/>
+                        </pic:spPr>
+                      </pic:pic>
+                    </a:graphicData>
+                  </a:graphic>
+                </wp:inline>
+              </w:drawing>
+            </w:r>
+          </w:p>
+          <w:p>
+            <w:pPr>
+              <w:jc w:val="center"/>
+            </w:pPr>
+            <w:r>
+              <w:rPr>
+                <w:rFonts w:ascii="Times New Roman" w:hAnsi="Times New Roman" w:cs="Times New Roman"/>
+                <w:b/>
+                <w:bCs/>
+                <w:highlight w:val="yellow"/>
+                <w:lang w:val="tr-TR"/>
+              </w:rPr>
+              <w:t xml:space="preserve">Shutter id: 2664011831</w:t>
+            </w:r>
+          </w:p>
+          <w:p>
+            <w:pPr>
+              <w:jc w:val="center"/>
+              <w:rPr>
+                <w:rFonts w:ascii="Times New Roman" w:hAnsi="Times New Roman" w:cs="Times New Roman"/>
+                <w:lang w:val="tr-TR"/>
+              </w:rPr>
+            </w:pPr>
+            <w:r>
+              <w:rPr>
+                <w:rFonts w:ascii="Times New Roman" w:hAnsi="Times New Roman" w:cs="Times New Roman"/>
+                <w:b/>
+                <w:bCs/>
+                <w:lang w:val="tr-TR"/>
+              </w:rPr>
+              <w:t xml:space="preserve">Görsel A:</w:t>
+            </w:r>
+            <w:r>
+              <w:rPr>
+                <w:rFonts w:ascii="Times New Roman" w:hAnsi="Times New Roman" w:cs="Times New Roman"/>
+                <w:lang w:val="tr-TR"/>
+              </w:rPr>
+              <w:t xml:space="preserve"> Bakırcılar çarşısında dövülen bakır kaplar</w:t>
+            </w:r>
+          </w:p>
+        </w:tc>
+        <w:tc>
+          <w:tcPr>
+            <w:tcW w:w="4500" w:type="dxa"/>
+          </w:tcPr>
+          <w:p>
+            <w:pPr>
+              <w:jc w:val="center"/>
+            </w:pPr>
+            <w:r>
+              <w:drawing>
+                <wp:inline xmlns:a="http://schemas.openxmlformats.org/drawingml/2006/main" xmlns:pic="http://schemas.openxmlformats.org/drawingml/2006/picture">
+                  <wp:extent cx="1238737" cy="1979998"/>
+                  <wp:docPr id="900018" name="Picture 900018"/>
+                  <wp:cNvGraphicFramePr>
+                    <a:graphicFrameLocks noChangeAspect="1"/>
+                  </wp:cNvGraphicFramePr>
+                  <a:graphic>
+                    <a:graphicData uri="http://schemas.openxmlformats.org/drawingml/2006/picture">
+                      <pic:pic>
+                        <pic:nvPicPr>
+                          <pic:cNvPr id="0" name="1301157493_d.jpg"/>
+                          <pic:cNvPicPr/>
+                        </pic:nvPicPr>
+                        <pic:blipFill>
+                          <a:blip r:embed="rId16"/>
+                          <a:stretch>
+                            <a:fillRect/>
+                          </a:stretch>
+                        </pic:blipFill>
+                        <pic:spPr>
+                          <a:xfrm>
+                            <a:off x="0" y="0"/>
+                            <a:ext cx="1238737" cy="1979998"/>
+                          </a:xfrm>
+                          <a:prstGeom prst="rect"/>
+                        </pic:spPr>
+                      </pic:pic>
+                    </a:graphicData>
+                  </a:graphic>
+                </wp:inline>
+              </w:drawing>
+            </w:r>
+          </w:p>
+          <w:p>
+            <w:pPr>
+              <w:jc w:val="center"/>
+            </w:pPr>
+            <w:r>
+              <w:rPr>
+                <w:rFonts w:ascii="Times New Roman" w:hAnsi="Times New Roman" w:cs="Times New Roman"/>
+                <w:b/>
+                <w:bCs/>
+                <w:highlight w:val="yellow"/>
+                <w:lang w:val="tr-TR"/>
+              </w:rPr>
+              <w:t xml:space="preserve">Shutter id: 1301157493</w:t>
+            </w:r>
+          </w:p>
+          <w:p>
+            <w:pPr>
+              <w:jc w:val="center"/>
+              <w:rPr>
+                <w:rFonts w:ascii="Times New Roman" w:hAnsi="Times New Roman" w:cs="Times New Roman"/>
+                <w:lang w:val="tr-TR"/>
+              </w:rPr>
+            </w:pPr>
+            <w:r>
+              <w:rPr>
+                <w:rFonts w:ascii="Times New Roman" w:hAnsi="Times New Roman" w:cs="Times New Roman"/>
+                <w:b/>
+                <w:bCs/>
+                <w:lang w:val="tr-TR"/>
+              </w:rPr>
+              <w:t xml:space="preserve">Görsel B:</w:t>
+            </w:r>
+            <w:r>
+              <w:rPr>
+                <w:rFonts w:ascii="Times New Roman" w:hAnsi="Times New Roman" w:cs="Times New Roman"/>
+                <w:lang w:val="tr-TR"/>
+              </w:rPr>
+              <w:t xml:space="preserve"> Magnezyum şeridin yanması</w:t>
+            </w:r>
+          </w:p>
+        </w:tc>
+      </w:tr>
+    </w:tbl>
     <w:p>
       <w:pPr>
         <w:keepNext/>

</xml_diff>

<commit_message>
Tek kalan fotograflara konuyla ilgili ikinci fotograf eklendi (1.1, 1.3, 1.4, 1.5, 2.1, 2.2, 2.3, 2.4, 2.7, 2.9), harfler kaydirildi ve metin atiflari yazildi; 3.1 Gorsel C ve D yan yana alindi
</commit_message>
<xml_diff>
--- a/Kim12-1-1-Redoks-Tepkimeleri.docx
+++ b/Kim12-1-1-Redoks-Tepkimeleri.docx
@@ -793,7 +793,7 @@
           <w:rFonts w:ascii="Times New Roman" w:hAnsi="Times New Roman" w:cs="Times New Roman"/>
           <w:lang w:val="tr-TR"/>
         </w:rPr>
-        <w:t xml:space="preserve">Metallerin bu farklı davranışları insanlık tarihine de yön vermiştir. Doğada saf hâlde bulunabilen altın ve bakır, Anadolu’da binlerce yıl önce işlenmeye başlanmıştır. Demir gibi metallerin cevherlerinden elde edilmesi ise çok daha sonra, yüksek sıcaklıkta karbonla yapılan işlemler sayesinde mümkün olmuştur. Bugün de metallerin cevherlerinden elde edilmesi, korunması ve pillerde enerji kaynağı olarak kullanılması, metallerin tepkimeye girme yatkınlıklarının anlaşılmasına dayanır.</w:t>
+        <w:t xml:space="preserve">Metallerin bu farklı davranışları insanlık tarihine de yön vermiştir. Doğada saf hâlde bulunabilen altın ve bakır, Anadolu’da binlerce yıl önce işlenmeye başlanmıştır. Demir gibi metallerin cevherlerinden elde edilmesi (Görsel E) ise çok daha sonra, yüksek sıcaklıkta karbonla yapılan işlemler sayesinde mümkün olmuştur. Bugün de metallerin cevherlerinden elde edilmesi, korunması ve pillerde enerji kaynağı olarak kullanılması, metallerin tepkimeye girme yatkınlıklarının anlaşılmasına dayanır.</w:t>
       </w:r>
     </w:p>
     <w:p>
@@ -5558,85 +5558,195 @@
         <w:t xml:space="preserve">Günlük hayatta karşılaşılan pek çok değişim de redoks tepkimesidir. Örneğin nemli havada bekleyen demir eşyaların paslanmasında demir atomları elektron vererek yükseltgenir, havadaki oksijen ise indirgenir (Görsel D). Pillerin elektrik üretmesi, metallerin cevherlerinden elde edilmesi, yakıtların yanması ve canlılarda besinlerden enerji elde edilmesi de redoks tepkimelerine dayanır.</w:t>
       </w:r>
     </w:p>
-    <w:p>
-      <w:pPr>
+    <w:tbl>
+      <w:tblPr>
+        <w:tblW w:w="9000" w:type="dxa"/>
         <w:jc w:val="center"/>
-      </w:pPr>
-      <w:r>
-        <w:drawing>
-          <wp:inline xmlns:a="http://schemas.openxmlformats.org/drawingml/2006/main" xmlns:pic="http://schemas.openxmlformats.org/drawingml/2006/picture">
-            <wp:extent cx="1578150" cy="2520000"/>
-            <wp:docPr id="900019" name="Picture 900019"/>
-            <wp:cNvGraphicFramePr>
-              <a:graphicFrameLocks noChangeAspect="1"/>
-            </wp:cNvGraphicFramePr>
-            <a:graphic>
-              <a:graphicData uri="http://schemas.openxmlformats.org/drawingml/2006/picture">
-                <pic:pic>
-                  <pic:nvPicPr>
-                    <pic:cNvPr id="0" name="2837328711_d.jpg"/>
-                    <pic:cNvPicPr/>
-                  </pic:nvPicPr>
-                  <pic:blipFill>
-                    <a:blip r:embed="rId17"/>
-                    <a:stretch>
-                      <a:fillRect/>
-                    </a:stretch>
-                  </pic:blipFill>
-                  <pic:spPr>
-                    <a:xfrm>
-                      <a:off x="0" y="0"/>
-                      <a:ext cx="1578150" cy="2520000"/>
-                    </a:xfrm>
-                    <a:prstGeom prst="rect"/>
-                  </pic:spPr>
-                </pic:pic>
-              </a:graphicData>
-            </a:graphic>
-          </wp:inline>
-        </w:drawing>
-      </w:r>
-    </w:p>
-    <w:p>
-      <w:pPr>
-        <w:jc w:val="center"/>
-      </w:pPr>
-      <w:r>
-        <w:rPr>
-          <w:rFonts w:ascii="Times New Roman" w:hAnsi="Times New Roman" w:cs="Times New Roman"/>
-          <w:b/>
-          <w:bCs/>
-          <w:highlight w:val="yellow"/>
-          <w:lang w:val="tr-TR"/>
-        </w:rPr>
-        <w:t xml:space="preserve">Shutter id: 2837328711</w:t>
-      </w:r>
-    </w:p>
-    <w:p>
-      <w:pPr>
-        <w:jc w:val="center"/>
-        <w:rPr>
-          <w:rFonts w:ascii="Times New Roman" w:hAnsi="Times New Roman" w:cs="Times New Roman"/>
-          <w:lang w:val="tr-TR"/>
-        </w:rPr>
-      </w:pPr>
-      <w:r>
-        <w:rPr>
-          <w:rFonts w:ascii="Times New Roman" w:hAnsi="Times New Roman" w:cs="Times New Roman"/>
-          <w:b/>
-          <w:bCs/>
-          <w:lang w:val="tr-TR"/>
-        </w:rPr>
-        <w:t xml:space="preserve">Görsel D:</w:t>
-      </w:r>
-      <w:r>
-        <w:rPr>
-          <w:rFonts w:ascii="Times New Roman" w:hAnsi="Times New Roman" w:cs="Times New Roman"/>
-          <w:lang w:val="tr-TR"/>
-        </w:rPr>
-        <w:t xml:space="preserve"> Paslanmış demir eşyalar</w:t>
-      </w:r>
-    </w:p>
+        <w:tblBorders>
+          <w:top w:val="nil"/>
+          <w:left w:val="nil"/>
+          <w:bottom w:val="nil"/>
+          <w:right w:val="nil"/>
+          <w:insideH w:val="nil"/>
+          <w:insideV w:val="nil"/>
+        </w:tblBorders>
+        <w:tblLayout w:type="fixed"/>
+      </w:tblPr>
+      <w:tblGrid>
+        <w:gridCol w:w="4500"/>
+        <w:gridCol w:w="4500"/>
+      </w:tblGrid>
+      <w:tr>
+        <w:tc>
+          <w:tcPr>
+            <w:tcW w:w="4500" w:type="dxa"/>
+          </w:tcPr>
+          <w:p>
+            <w:pPr>
+              <w:jc w:val="center"/>
+            </w:pPr>
+            <w:r>
+              <w:drawing>
+                <wp:inline xmlns:a="http://schemas.openxmlformats.org/drawingml/2006/main" xmlns:pic="http://schemas.openxmlformats.org/drawingml/2006/picture">
+                  <wp:extent cx="1239975" cy="1980000"/>
+                  <wp:docPr id="900019" name="Picture 900019"/>
+                  <wp:cNvGraphicFramePr>
+                    <a:graphicFrameLocks noChangeAspect="1"/>
+                  </wp:cNvGraphicFramePr>
+                  <a:graphic>
+                    <a:graphicData uri="http://schemas.openxmlformats.org/drawingml/2006/picture">
+                      <pic:pic>
+                        <pic:nvPicPr>
+                          <pic:cNvPr id="0" name="2837328711_d.jpg"/>
+                          <pic:cNvPicPr/>
+                        </pic:nvPicPr>
+                        <pic:blipFill>
+                          <a:blip r:embed="rId17"/>
+                          <a:stretch>
+                            <a:fillRect/>
+                          </a:stretch>
+                        </pic:blipFill>
+                        <pic:spPr>
+                          <a:xfrm>
+                            <a:off x="0" y="0"/>
+                            <a:ext cx="1239975" cy="1980000"/>
+                          </a:xfrm>
+                          <a:prstGeom prst="rect"/>
+                        </pic:spPr>
+                      </pic:pic>
+                    </a:graphicData>
+                  </a:graphic>
+                </wp:inline>
+              </w:drawing>
+            </w:r>
+          </w:p>
+          <w:p>
+            <w:pPr>
+              <w:jc w:val="center"/>
+            </w:pPr>
+            <w:r>
+              <w:rPr>
+                <w:rFonts w:ascii="Times New Roman" w:hAnsi="Times New Roman" w:cs="Times New Roman"/>
+                <w:b/>
+                <w:bCs/>
+                <w:highlight w:val="yellow"/>
+                <w:lang w:val="tr-TR"/>
+              </w:rPr>
+              <w:t xml:space="preserve">Shutter id: 2837328711</w:t>
+            </w:r>
+          </w:p>
+          <w:p>
+            <w:pPr>
+              <w:jc w:val="center"/>
+              <w:rPr>
+                <w:rFonts w:ascii="Times New Roman" w:hAnsi="Times New Roman" w:cs="Times New Roman"/>
+                <w:lang w:val="tr-TR"/>
+              </w:rPr>
+            </w:pPr>
+            <w:r>
+              <w:rPr>
+                <w:rFonts w:ascii="Times New Roman" w:hAnsi="Times New Roman" w:cs="Times New Roman"/>
+                <w:b/>
+                <w:bCs/>
+                <w:lang w:val="tr-TR"/>
+              </w:rPr>
+              <w:t xml:space="preserve">Görsel D:</w:t>
+            </w:r>
+            <w:r>
+              <w:rPr>
+                <w:rFonts w:ascii="Times New Roman" w:hAnsi="Times New Roman" w:cs="Times New Roman"/>
+                <w:lang w:val="tr-TR"/>
+              </w:rPr>
+              <w:t xml:space="preserve"> Paslanmış demir eşyalar</w:t>
+            </w:r>
+          </w:p>
+        </w:tc>
+        <w:tc>
+          <w:tcPr>
+            <w:tcW w:w="4500" w:type="dxa"/>
+          </w:tcPr>
+          <w:p>
+            <w:pPr>
+              <w:jc w:val="center"/>
+            </w:pPr>
+            <w:r>
+              <w:drawing>
+                <wp:inline xmlns:a="http://schemas.openxmlformats.org/drawingml/2006/main" xmlns:pic="http://schemas.openxmlformats.org/drawingml/2006/picture">
+                  <wp:extent cx="2628000" cy="1930704"/>
+                  <wp:docPr id="900021" name="Picture 900021"/>
+                  <wp:cNvGraphicFramePr>
+                    <a:graphicFrameLocks noChangeAspect="1"/>
+                  </wp:cNvGraphicFramePr>
+                  <a:graphic>
+                    <a:graphicData uri="http://schemas.openxmlformats.org/drawingml/2006/picture">
+                      <pic:pic>
+                        <pic:nvPicPr>
+                          <pic:cNvPr id="0" name="2783358625_d.jpg"/>
+                          <pic:cNvPicPr/>
+                        </pic:nvPicPr>
+                        <pic:blipFill>
+                          <a:blip r:embed="rId19"/>
+                          <a:stretch>
+                            <a:fillRect/>
+                          </a:stretch>
+                        </pic:blipFill>
+                        <pic:spPr>
+                          <a:xfrm>
+                            <a:off x="0" y="0"/>
+                            <a:ext cx="2628000" cy="1930704"/>
+                          </a:xfrm>
+                          <a:prstGeom prst="rect"/>
+                        </pic:spPr>
+                      </pic:pic>
+                    </a:graphicData>
+                  </a:graphic>
+                </wp:inline>
+              </w:drawing>
+            </w:r>
+          </w:p>
+          <w:p>
+            <w:pPr>
+              <w:jc w:val="center"/>
+            </w:pPr>
+            <w:r>
+              <w:rPr>
+                <w:rFonts w:ascii="Times New Roman" w:hAnsi="Times New Roman" w:cs="Times New Roman"/>
+                <w:b/>
+                <w:bCs/>
+                <w:highlight w:val="yellow"/>
+                <w:lang w:val="tr-TR"/>
+              </w:rPr>
+              <w:t xml:space="preserve">Shutter id: 2783358625</w:t>
+            </w:r>
+          </w:p>
+          <w:p>
+            <w:pPr>
+              <w:jc w:val="center"/>
+              <w:rPr>
+                <w:rFonts w:ascii="Times New Roman" w:hAnsi="Times New Roman" w:cs="Times New Roman"/>
+                <w:lang w:val="tr-TR"/>
+              </w:rPr>
+            </w:pPr>
+            <w:r>
+              <w:rPr>
+                <w:rFonts w:ascii="Times New Roman" w:hAnsi="Times New Roman" w:cs="Times New Roman"/>
+                <w:b/>
+                <w:bCs/>
+                <w:lang w:val="tr-TR"/>
+              </w:rPr>
+              <w:t xml:space="preserve">Görsel E:</w:t>
+            </w:r>
+            <w:r>
+              <w:rPr>
+                <w:rFonts w:ascii="Times New Roman" w:hAnsi="Times New Roman" w:cs="Times New Roman"/>
+                <w:lang w:val="tr-TR"/>
+              </w:rPr>
+              <w:t xml:space="preserve"> Yüksek fırında cevherden elde edilen sıvı demir</w:t>
+            </w:r>
+          </w:p>
+        </w:tc>
+      </w:tr>
+    </w:tbl>
     <w:p>
       <w:pPr>
         <w:keepNext/>

</xml_diff>